<commit_message>
changed back to best portfolio version
</commit_message>
<xml_diff>
--- a/CV/Spenceley_CV2026.docx
+++ b/CV/Spenceley_CV2026.docx
@@ -233,7 +233,25 @@
             <w:sz w:val="22"/>
             <w:szCs w:val="22"/>
           </w:rPr>
-          <w:t>Google Scholar</w:t>
+          <w:t>Google S</w:t>
+        </w:r>
+        <w:r>
+          <w:rPr>
+            <w:rStyle w:val="Hyperlink"/>
+            <w:rFonts w:ascii="Times New Roman" w:hAnsi="Times New Roman" w:cs="Times New Roman"/>
+            <w:sz w:val="22"/>
+            <w:szCs w:val="22"/>
+          </w:rPr>
+          <w:t>c</w:t>
+        </w:r>
+        <w:r>
+          <w:rPr>
+            <w:rStyle w:val="Hyperlink"/>
+            <w:rFonts w:ascii="Times New Roman" w:hAnsi="Times New Roman" w:cs="Times New Roman"/>
+            <w:sz w:val="22"/>
+            <w:szCs w:val="22"/>
+          </w:rPr>
+          <w:t>holar</w:t>
         </w:r>
       </w:hyperlink>
     </w:p>
@@ -652,15 +670,19 @@
         </w:pBdr>
         <w:rPr>
           <w:rFonts w:ascii="Times New Roman" w:hAnsi="Times New Roman" w:cs="Times New Roman"/>
-          <w:i/>
-          <w:iCs/>
-          <w:sz w:val="22"/>
-          <w:szCs w:val="22"/>
-        </w:rPr>
-      </w:pPr>
-      <w:r>
-        <w:rPr>
-          <w:rFonts w:ascii="Times New Roman" w:hAnsi="Times New Roman" w:cs="Times New Roman"/>
+          <w:b/>
+          <w:bCs/>
+          <w:i/>
+          <w:iCs/>
+          <w:sz w:val="22"/>
+          <w:szCs w:val="22"/>
+        </w:rPr>
+      </w:pPr>
+      <w:r>
+        <w:rPr>
+          <w:rFonts w:ascii="Times New Roman" w:hAnsi="Times New Roman" w:cs="Times New Roman"/>
+          <w:b/>
+          <w:bCs/>
           <w:i/>
           <w:iCs/>
           <w:sz w:val="22"/>
@@ -935,6 +957,9 @@
     </w:p>
     <w:p>
       <w:pPr>
+        <w:pBdr>
+          <w:bottom w:val="single" w:sz="4" w:space="1" w:color="auto"/>
+        </w:pBdr>
         <w:rPr>
           <w:rFonts w:ascii="Times New Roman" w:hAnsi="Times New Roman" w:cs="Times New Roman"/>
           <w:b/>
@@ -949,20 +974,6 @@
         </w:rPr>
         <w:t>RESEARCH EXPERIENCE</w:t>
       </w:r>
-    </w:p>
-    <w:p>
-      <w:pPr>
-        <w:pBdr>
-          <w:top w:val="single" w:sz="4" w:space="1" w:color="auto"/>
-        </w:pBdr>
-        <w:rPr>
-          <w:rFonts w:ascii="Times New Roman" w:hAnsi="Times New Roman" w:cs="Times New Roman"/>
-          <w:b/>
-          <w:bCs/>
-          <w:sz w:val="22"/>
-          <w:szCs w:val="22"/>
-        </w:rPr>
-      </w:pPr>
     </w:p>
     <w:p>
       <w:pPr>
@@ -2499,7 +2510,103 @@
           <w:sz w:val="22"/>
           <w:szCs w:val="22"/>
         </w:rPr>
-        <w:t xml:space="preserve">: FIPRED, Augmented reality cueing in visual search, germane load. </w:t>
+        <w:t xml:space="preserve">: FIPRED, Augmented </w:t>
+      </w:r>
+      <w:r>
+        <w:rPr>
+          <w:rFonts w:ascii="Times New Roman" w:hAnsi="Times New Roman" w:cs="Times New Roman"/>
+          <w:sz w:val="22"/>
+          <w:szCs w:val="22"/>
+        </w:rPr>
+        <w:t>R</w:t>
+      </w:r>
+      <w:r>
+        <w:rPr>
+          <w:rFonts w:ascii="Times New Roman" w:hAnsi="Times New Roman" w:cs="Times New Roman"/>
+          <w:sz w:val="22"/>
+          <w:szCs w:val="22"/>
+        </w:rPr>
+        <w:t xml:space="preserve">eality </w:t>
+      </w:r>
+      <w:r>
+        <w:rPr>
+          <w:rFonts w:ascii="Times New Roman" w:hAnsi="Times New Roman" w:cs="Times New Roman"/>
+          <w:sz w:val="22"/>
+          <w:szCs w:val="22"/>
+        </w:rPr>
+        <w:t>C</w:t>
+      </w:r>
+      <w:r>
+        <w:rPr>
+          <w:rFonts w:ascii="Times New Roman" w:hAnsi="Times New Roman" w:cs="Times New Roman"/>
+          <w:sz w:val="22"/>
+          <w:szCs w:val="22"/>
+        </w:rPr>
+        <w:t xml:space="preserve">ueing in </w:t>
+      </w:r>
+      <w:r>
+        <w:rPr>
+          <w:rFonts w:ascii="Times New Roman" w:hAnsi="Times New Roman" w:cs="Times New Roman"/>
+          <w:sz w:val="22"/>
+          <w:szCs w:val="22"/>
+        </w:rPr>
+        <w:t>V</w:t>
+      </w:r>
+      <w:r>
+        <w:rPr>
+          <w:rFonts w:ascii="Times New Roman" w:hAnsi="Times New Roman" w:cs="Times New Roman"/>
+          <w:sz w:val="22"/>
+          <w:szCs w:val="22"/>
+        </w:rPr>
+        <w:t xml:space="preserve">isual </w:t>
+      </w:r>
+      <w:r>
+        <w:rPr>
+          <w:rFonts w:ascii="Times New Roman" w:hAnsi="Times New Roman" w:cs="Times New Roman"/>
+          <w:sz w:val="22"/>
+          <w:szCs w:val="22"/>
+        </w:rPr>
+        <w:t>S</w:t>
+      </w:r>
+      <w:r>
+        <w:rPr>
+          <w:rFonts w:ascii="Times New Roman" w:hAnsi="Times New Roman" w:cs="Times New Roman"/>
+          <w:sz w:val="22"/>
+          <w:szCs w:val="22"/>
+        </w:rPr>
+        <w:t xml:space="preserve">earch, </w:t>
+      </w:r>
+      <w:r>
+        <w:rPr>
+          <w:rFonts w:ascii="Times New Roman" w:hAnsi="Times New Roman" w:cs="Times New Roman"/>
+          <w:sz w:val="22"/>
+          <w:szCs w:val="22"/>
+        </w:rPr>
+        <w:t>G</w:t>
+      </w:r>
+      <w:r>
+        <w:rPr>
+          <w:rFonts w:ascii="Times New Roman" w:hAnsi="Times New Roman" w:cs="Times New Roman"/>
+          <w:sz w:val="22"/>
+          <w:szCs w:val="22"/>
+        </w:rPr>
+        <w:t xml:space="preserve">ermane </w:t>
+      </w:r>
+      <w:r>
+        <w:rPr>
+          <w:rFonts w:ascii="Times New Roman" w:hAnsi="Times New Roman" w:cs="Times New Roman"/>
+          <w:sz w:val="22"/>
+          <w:szCs w:val="22"/>
+        </w:rPr>
+        <w:t>L</w:t>
+      </w:r>
+      <w:r>
+        <w:rPr>
+          <w:rFonts w:ascii="Times New Roman" w:hAnsi="Times New Roman" w:cs="Times New Roman"/>
+          <w:sz w:val="22"/>
+          <w:szCs w:val="22"/>
+        </w:rPr>
+        <w:t xml:space="preserve">oad. </w:t>
       </w:r>
     </w:p>
     <w:p>
@@ -2551,7 +2658,7 @@
           <w:sz w:val="22"/>
           <w:szCs w:val="22"/>
         </w:rPr>
-        <w:t>Data collection with graduate students’ (Dr. Amelia Warden) studies and a project I developed, FIPRED.</w:t>
+        <w:t>Data collection with graduate student studies and a project I developed, FIPRED.</w:t>
       </w:r>
     </w:p>
     <w:p>
@@ -2947,6 +3054,9 @@
     </w:p>
     <w:p>
       <w:pPr>
+        <w:pBdr>
+          <w:bottom w:val="single" w:sz="4" w:space="1" w:color="auto"/>
+        </w:pBdr>
         <w:rPr>
           <w:rFonts w:ascii="Times New Roman" w:hAnsi="Times New Roman" w:cs="Times New Roman"/>
           <w:b/>
@@ -2964,20 +3074,6 @@
     </w:p>
     <w:p>
       <w:pPr>
-        <w:pBdr>
-          <w:top w:val="single" w:sz="4" w:space="1" w:color="auto"/>
-        </w:pBdr>
-        <w:rPr>
-          <w:rFonts w:ascii="Times New Roman" w:hAnsi="Times New Roman" w:cs="Times New Roman"/>
-          <w:b/>
-          <w:bCs/>
-          <w:sz w:val="22"/>
-          <w:szCs w:val="22"/>
-        </w:rPr>
-      </w:pPr>
-    </w:p>
-    <w:p>
-      <w:pPr>
         <w:ind w:left="720" w:hanging="720"/>
         <w:rPr>
           <w:rFonts w:ascii="Times New Roman" w:hAnsi="Times New Roman" w:cs="Times New Roman"/>
@@ -3003,6 +3099,158 @@
           <w:sz w:val="22"/>
           <w:szCs w:val="22"/>
         </w:rPr>
+        <w:t>, R., Wickens</w:t>
+      </w:r>
+      <w:r>
+        <w:rPr>
+          <w:rFonts w:ascii="Times New Roman" w:hAnsi="Times New Roman" w:cs="Times New Roman"/>
+          <w:sz w:val="22"/>
+          <w:szCs w:val="22"/>
+        </w:rPr>
+        <w:t>,</w:t>
+      </w:r>
+      <w:r>
+        <w:rPr>
+          <w:rFonts w:ascii="Times New Roman" w:hAnsi="Times New Roman" w:cs="Times New Roman"/>
+          <w:sz w:val="22"/>
+          <w:szCs w:val="22"/>
+        </w:rPr>
+        <w:t xml:space="preserve"> C., &amp; De Toledo Piza, B. (2025). </w:t>
+      </w:r>
+      <w:r>
+        <w:rPr>
+          <w:rFonts w:ascii="Times New Roman" w:hAnsi="Times New Roman" w:cs="Times New Roman"/>
+          <w:i/>
+          <w:iCs/>
+          <w:sz w:val="22"/>
+          <w:szCs w:val="22"/>
+        </w:rPr>
+        <w:t>F</w:t>
+      </w:r>
+      <w:r>
+        <w:rPr>
+          <w:rFonts w:ascii="Times New Roman" w:hAnsi="Times New Roman" w:cs="Times New Roman"/>
+          <w:i/>
+          <w:iCs/>
+          <w:sz w:val="22"/>
+          <w:szCs w:val="22"/>
+        </w:rPr>
+        <w:t>IPRED: A study of predictive automated displays for wildfire fighting management.</w:t>
+      </w:r>
+      <w:r>
+        <w:rPr>
+          <w:rFonts w:ascii="Times New Roman" w:hAnsi="Times New Roman" w:cs="Times New Roman"/>
+          <w:i/>
+          <w:iCs/>
+          <w:sz w:val="22"/>
+          <w:szCs w:val="22"/>
+        </w:rPr>
+        <w:t xml:space="preserve"> </w:t>
+      </w:r>
+      <w:r>
+        <w:rPr>
+          <w:rFonts w:ascii="Times New Roman" w:hAnsi="Times New Roman" w:cs="Times New Roman"/>
+          <w:sz w:val="22"/>
+          <w:szCs w:val="22"/>
+        </w:rPr>
+        <w:t xml:space="preserve">Human Factors and Ergonomics Society – ASPIRE, Chicago, Illinois. </w:t>
+      </w:r>
+      <w:r>
+        <w:rPr>
+          <w:rFonts w:ascii="Times New Roman" w:hAnsi="Times New Roman" w:cs="Times New Roman"/>
+          <w:b/>
+          <w:bCs/>
+          <w:sz w:val="22"/>
+          <w:szCs w:val="22"/>
+        </w:rPr>
+        <w:t>- Poster</w:t>
+      </w:r>
+    </w:p>
+    <w:p>
+      <w:pPr>
+        <w:ind w:left="720" w:hanging="720"/>
+        <w:rPr>
+          <w:rFonts w:ascii="Times New Roman" w:hAnsi="Times New Roman" w:cs="Times New Roman"/>
+          <w:b/>
+          <w:bCs/>
+          <w:sz w:val="22"/>
+          <w:szCs w:val="22"/>
+        </w:rPr>
+      </w:pPr>
+      <w:proofErr w:type="spellStart"/>
+      <w:r>
+        <w:rPr>
+          <w:rFonts w:ascii="Times New Roman" w:hAnsi="Times New Roman" w:cs="Times New Roman"/>
+          <w:sz w:val="22"/>
+          <w:szCs w:val="22"/>
+        </w:rPr>
+        <w:t>Spenceley</w:t>
+      </w:r>
+      <w:proofErr w:type="spellEnd"/>
+      <w:r>
+        <w:rPr>
+          <w:rFonts w:ascii="Times New Roman" w:hAnsi="Times New Roman" w:cs="Times New Roman"/>
+          <w:sz w:val="22"/>
+          <w:szCs w:val="22"/>
+        </w:rPr>
+        <w:t xml:space="preserve">, R., Yadav, A., &amp; Mehta, R. (2025). </w:t>
+      </w:r>
+      <w:r>
+        <w:rPr>
+          <w:rFonts w:ascii="Times New Roman" w:hAnsi="Times New Roman" w:cs="Times New Roman"/>
+          <w:i/>
+          <w:iCs/>
+          <w:sz w:val="22"/>
+          <w:szCs w:val="22"/>
+        </w:rPr>
+        <w:t xml:space="preserve">EEG theta power varies across roles in mixed human-robot teams. </w:t>
+      </w:r>
+      <w:r>
+        <w:rPr>
+          <w:rFonts w:ascii="Times New Roman" w:hAnsi="Times New Roman" w:cs="Times New Roman"/>
+          <w:sz w:val="22"/>
+          <w:szCs w:val="22"/>
+        </w:rPr>
+        <w:t xml:space="preserve">Human Factors and Ergonomics Society – ASPIRE, Chicago, Illinois. </w:t>
+      </w:r>
+      <w:r>
+        <w:rPr>
+          <w:rFonts w:ascii="Times New Roman" w:hAnsi="Times New Roman" w:cs="Times New Roman"/>
+          <w:b/>
+          <w:bCs/>
+          <w:sz w:val="22"/>
+          <w:szCs w:val="22"/>
+        </w:rPr>
+        <w:t>- Poster</w:t>
+      </w:r>
+    </w:p>
+    <w:p>
+      <w:pPr>
+        <w:ind w:left="720" w:hanging="720"/>
+        <w:rPr>
+          <w:rFonts w:ascii="Times New Roman" w:hAnsi="Times New Roman" w:cs="Times New Roman"/>
+          <w:b/>
+          <w:bCs/>
+          <w:sz w:val="22"/>
+          <w:szCs w:val="22"/>
+        </w:rPr>
+      </w:pPr>
+      <w:proofErr w:type="spellStart"/>
+      <w:r>
+        <w:rPr>
+          <w:rFonts w:ascii="Times New Roman" w:hAnsi="Times New Roman" w:cs="Times New Roman"/>
+          <w:sz w:val="22"/>
+          <w:szCs w:val="22"/>
+        </w:rPr>
+        <w:t>Spenceley</w:t>
+      </w:r>
+      <w:proofErr w:type="spellEnd"/>
+      <w:r>
+        <w:rPr>
+          <w:rFonts w:ascii="Times New Roman" w:hAnsi="Times New Roman" w:cs="Times New Roman"/>
+          <w:sz w:val="22"/>
+          <w:szCs w:val="22"/>
+        </w:rPr>
         <w:t xml:space="preserve">, R., Rice, M., &amp; Davalos, D. (2024). </w:t>
       </w:r>
       <w:r>
@@ -3021,15 +3269,7 @@
           <w:sz w:val="22"/>
           <w:szCs w:val="22"/>
         </w:rPr>
-        <w:t>. Rocky Mountain Psychology Association Conference, Denver, C</w:t>
-      </w:r>
-      <w:r>
-        <w:rPr>
-          <w:rFonts w:ascii="Times New Roman" w:hAnsi="Times New Roman" w:cs="Times New Roman"/>
-          <w:sz w:val="22"/>
-          <w:szCs w:val="22"/>
-        </w:rPr>
-        <w:t>olorado.</w:t>
+        <w:t>. Rocky Mountain Psychology Association Conference, Denver, Colorado.</w:t>
       </w:r>
       <w:r>
         <w:rPr>
@@ -3038,158 +3278,6 @@
           <w:szCs w:val="22"/>
         </w:rPr>
         <w:t xml:space="preserve"> </w:t>
-      </w:r>
-      <w:r>
-        <w:rPr>
-          <w:rFonts w:ascii="Times New Roman" w:hAnsi="Times New Roman" w:cs="Times New Roman"/>
-          <w:b/>
-          <w:bCs/>
-          <w:sz w:val="22"/>
-          <w:szCs w:val="22"/>
-        </w:rPr>
-        <w:t>- Poster</w:t>
-      </w:r>
-    </w:p>
-    <w:p>
-      <w:pPr>
-        <w:ind w:left="720" w:hanging="720"/>
-        <w:rPr>
-          <w:rFonts w:ascii="Times New Roman" w:hAnsi="Times New Roman" w:cs="Times New Roman"/>
-          <w:b/>
-          <w:bCs/>
-          <w:sz w:val="22"/>
-          <w:szCs w:val="22"/>
-        </w:rPr>
-      </w:pPr>
-      <w:proofErr w:type="spellStart"/>
-      <w:r>
-        <w:rPr>
-          <w:rFonts w:ascii="Times New Roman" w:hAnsi="Times New Roman" w:cs="Times New Roman"/>
-          <w:sz w:val="22"/>
-          <w:szCs w:val="22"/>
-        </w:rPr>
-        <w:t>Spenceley</w:t>
-      </w:r>
-      <w:proofErr w:type="spellEnd"/>
-      <w:r>
-        <w:rPr>
-          <w:rFonts w:ascii="Times New Roman" w:hAnsi="Times New Roman" w:cs="Times New Roman"/>
-          <w:sz w:val="22"/>
-          <w:szCs w:val="22"/>
-        </w:rPr>
-        <w:t>, R., Wickens</w:t>
-      </w:r>
-      <w:r>
-        <w:rPr>
-          <w:rFonts w:ascii="Times New Roman" w:hAnsi="Times New Roman" w:cs="Times New Roman"/>
-          <w:sz w:val="22"/>
-          <w:szCs w:val="22"/>
-        </w:rPr>
-        <w:t>,</w:t>
-      </w:r>
-      <w:r>
-        <w:rPr>
-          <w:rFonts w:ascii="Times New Roman" w:hAnsi="Times New Roman" w:cs="Times New Roman"/>
-          <w:sz w:val="22"/>
-          <w:szCs w:val="22"/>
-        </w:rPr>
-        <w:t xml:space="preserve"> C., &amp; De Toledo Piza, B. (2025). </w:t>
-      </w:r>
-      <w:r>
-        <w:rPr>
-          <w:rFonts w:ascii="Times New Roman" w:hAnsi="Times New Roman" w:cs="Times New Roman"/>
-          <w:i/>
-          <w:iCs/>
-          <w:sz w:val="22"/>
-          <w:szCs w:val="22"/>
-        </w:rPr>
-        <w:t>F</w:t>
-      </w:r>
-      <w:r>
-        <w:rPr>
-          <w:rFonts w:ascii="Times New Roman" w:hAnsi="Times New Roman" w:cs="Times New Roman"/>
-          <w:i/>
-          <w:iCs/>
-          <w:sz w:val="22"/>
-          <w:szCs w:val="22"/>
-        </w:rPr>
-        <w:t>IPRED: A study of predictive automated displays for wildfire fighting management.</w:t>
-      </w:r>
-      <w:r>
-        <w:rPr>
-          <w:rFonts w:ascii="Times New Roman" w:hAnsi="Times New Roman" w:cs="Times New Roman"/>
-          <w:i/>
-          <w:iCs/>
-          <w:sz w:val="22"/>
-          <w:szCs w:val="22"/>
-        </w:rPr>
-        <w:t xml:space="preserve"> </w:t>
-      </w:r>
-      <w:r>
-        <w:rPr>
-          <w:rFonts w:ascii="Times New Roman" w:hAnsi="Times New Roman" w:cs="Times New Roman"/>
-          <w:sz w:val="22"/>
-          <w:szCs w:val="22"/>
-        </w:rPr>
-        <w:t xml:space="preserve">Human Factors and Ergonomics Society – ASPIRE, Chicago, Illinois. </w:t>
-      </w:r>
-      <w:r>
-        <w:rPr>
-          <w:rFonts w:ascii="Times New Roman" w:hAnsi="Times New Roman" w:cs="Times New Roman"/>
-          <w:b/>
-          <w:bCs/>
-          <w:sz w:val="22"/>
-          <w:szCs w:val="22"/>
-        </w:rPr>
-        <w:t>- Poster</w:t>
-      </w:r>
-    </w:p>
-    <w:p>
-      <w:pPr>
-        <w:ind w:left="720" w:hanging="720"/>
-        <w:rPr>
-          <w:rFonts w:ascii="Times New Roman" w:hAnsi="Times New Roman" w:cs="Times New Roman"/>
-          <w:b/>
-          <w:bCs/>
-          <w:sz w:val="22"/>
-          <w:szCs w:val="22"/>
-        </w:rPr>
-      </w:pPr>
-      <w:proofErr w:type="spellStart"/>
-      <w:r>
-        <w:rPr>
-          <w:rFonts w:ascii="Times New Roman" w:hAnsi="Times New Roman" w:cs="Times New Roman"/>
-          <w:sz w:val="22"/>
-          <w:szCs w:val="22"/>
-        </w:rPr>
-        <w:t>Spenceley</w:t>
-      </w:r>
-      <w:proofErr w:type="spellEnd"/>
-      <w:r>
-        <w:rPr>
-          <w:rFonts w:ascii="Times New Roman" w:hAnsi="Times New Roman" w:cs="Times New Roman"/>
-          <w:sz w:val="22"/>
-          <w:szCs w:val="22"/>
-        </w:rPr>
-        <w:t xml:space="preserve">, R., Yadav, A., &amp; Mehta, R. (2025). </w:t>
-      </w:r>
-      <w:r>
-        <w:rPr>
-          <w:rFonts w:ascii="Times New Roman" w:hAnsi="Times New Roman" w:cs="Times New Roman"/>
-          <w:i/>
-          <w:iCs/>
-          <w:sz w:val="22"/>
-          <w:szCs w:val="22"/>
-        </w:rPr>
-        <w:t xml:space="preserve">EEG theta power varies across roles in mixed human-robot teams. </w:t>
-      </w:r>
-      <w:r>
-        <w:rPr>
-          <w:rFonts w:ascii="Times New Roman" w:hAnsi="Times New Roman" w:cs="Times New Roman"/>
-          <w:sz w:val="22"/>
-          <w:szCs w:val="22"/>
-        </w:rPr>
-        <w:t xml:space="preserve">Human Factors and Ergonomics Society – ASPIRE, Chicago, Illinois. </w:t>
       </w:r>
       <w:r>
         <w:rPr>
@@ -3253,17 +3341,6 @@
       <w:pPr>
         <w:rPr>
           <w:rFonts w:ascii="Times New Roman" w:hAnsi="Times New Roman" w:cs="Times New Roman"/>
-          <w:b/>
-          <w:bCs/>
-          <w:sz w:val="22"/>
-          <w:szCs w:val="22"/>
-        </w:rPr>
-      </w:pPr>
-    </w:p>
-    <w:p>
-      <w:pPr>
-        <w:rPr>
-          <w:rFonts w:ascii="Times New Roman" w:hAnsi="Times New Roman" w:cs="Times New Roman"/>
           <w:sz w:val="22"/>
           <w:szCs w:val="22"/>
         </w:rPr>
@@ -3376,6 +3453,134 @@
           <w:szCs w:val="22"/>
         </w:rPr>
       </w:pPr>
+      <w:r>
+        <w:rPr>
+          <w:rFonts w:ascii="Times New Roman" w:hAnsi="Times New Roman" w:cs="Times New Roman"/>
+          <w:b/>
+          <w:bCs/>
+          <w:sz w:val="22"/>
+          <w:szCs w:val="22"/>
+        </w:rPr>
+        <w:t>Instructor</w:t>
+      </w:r>
+      <w:r>
+        <w:rPr>
+          <w:rFonts w:ascii="Times New Roman" w:hAnsi="Times New Roman" w:cs="Times New Roman"/>
+          <w:bCs/>
+          <w:sz w:val="22"/>
+          <w:szCs w:val="22"/>
+        </w:rPr>
+        <w:t xml:space="preserve"> </w:t>
+      </w:r>
+      <w:r>
+        <w:rPr>
+          <w:rFonts w:ascii="Times New Roman" w:hAnsi="Times New Roman" w:cs="Times New Roman"/>
+          <w:bCs/>
+          <w:sz w:val="22"/>
+          <w:szCs w:val="22"/>
+        </w:rPr>
+        <w:tab/>
+      </w:r>
+      <w:r>
+        <w:rPr>
+          <w:rFonts w:ascii="Times New Roman" w:hAnsi="Times New Roman" w:cs="Times New Roman"/>
+          <w:bCs/>
+          <w:sz w:val="22"/>
+          <w:szCs w:val="22"/>
+        </w:rPr>
+        <w:tab/>
+      </w:r>
+      <w:r>
+        <w:rPr>
+          <w:rFonts w:ascii="Times New Roman" w:hAnsi="Times New Roman" w:cs="Times New Roman"/>
+          <w:bCs/>
+          <w:sz w:val="22"/>
+          <w:szCs w:val="22"/>
+        </w:rPr>
+        <w:tab/>
+      </w:r>
+      <w:r>
+        <w:rPr>
+          <w:rFonts w:ascii="Times New Roman" w:hAnsi="Times New Roman" w:cs="Times New Roman"/>
+          <w:bCs/>
+          <w:sz w:val="22"/>
+          <w:szCs w:val="22"/>
+        </w:rPr>
+        <w:tab/>
+      </w:r>
+      <w:r>
+        <w:rPr>
+          <w:rFonts w:ascii="Times New Roman" w:hAnsi="Times New Roman" w:cs="Times New Roman"/>
+          <w:bCs/>
+          <w:sz w:val="22"/>
+          <w:szCs w:val="22"/>
+        </w:rPr>
+        <w:tab/>
+      </w:r>
+      <w:r>
+        <w:rPr>
+          <w:rFonts w:ascii="Times New Roman" w:hAnsi="Times New Roman" w:cs="Times New Roman"/>
+          <w:bCs/>
+          <w:sz w:val="22"/>
+          <w:szCs w:val="22"/>
+        </w:rPr>
+        <w:tab/>
+      </w:r>
+      <w:r>
+        <w:rPr>
+          <w:rFonts w:ascii="Times New Roman" w:hAnsi="Times New Roman" w:cs="Times New Roman"/>
+          <w:bCs/>
+          <w:sz w:val="22"/>
+          <w:szCs w:val="22"/>
+        </w:rPr>
+        <w:tab/>
+      </w:r>
+      <w:r>
+        <w:rPr>
+          <w:rFonts w:ascii="Times New Roman" w:hAnsi="Times New Roman" w:cs="Times New Roman"/>
+          <w:bCs/>
+          <w:sz w:val="22"/>
+          <w:szCs w:val="22"/>
+        </w:rPr>
+        <w:tab/>
+      </w:r>
+      <w:r>
+        <w:rPr>
+          <w:rFonts w:ascii="Times New Roman" w:hAnsi="Times New Roman" w:cs="Times New Roman"/>
+          <w:bCs/>
+          <w:sz w:val="22"/>
+          <w:szCs w:val="22"/>
+        </w:rPr>
+        <w:tab/>
+      </w:r>
+      <w:r>
+        <w:rPr>
+          <w:rFonts w:ascii="Times New Roman" w:hAnsi="Times New Roman" w:cs="Times New Roman"/>
+          <w:bCs/>
+          <w:sz w:val="22"/>
+          <w:szCs w:val="22"/>
+        </w:rPr>
+        <w:tab/>
+      </w:r>
+      <w:r>
+        <w:rPr>
+          <w:rFonts w:ascii="Times New Roman" w:hAnsi="Times New Roman" w:cs="Times New Roman"/>
+          <w:bCs/>
+          <w:sz w:val="22"/>
+          <w:szCs w:val="22"/>
+        </w:rPr>
+        <w:tab/>
+        <w:t xml:space="preserve">          </w:t>
+      </w:r>
+      <w:r>
+        <w:rPr>
+          <w:rFonts w:ascii="Times New Roman" w:hAnsi="Times New Roman" w:cs="Times New Roman"/>
+          <w:bCs/>
+          <w:sz w:val="22"/>
+          <w:szCs w:val="22"/>
+        </w:rPr>
+        <w:t>Fall 2024</w:t>
+      </w:r>
     </w:p>
     <w:p>
       <w:pPr>
@@ -3384,12 +3589,101 @@
         </w:pBdr>
         <w:rPr>
           <w:rFonts w:ascii="Times New Roman" w:hAnsi="Times New Roman" w:cs="Times New Roman"/>
-          <w:b/>
-          <w:bCs/>
-          <w:sz w:val="22"/>
-          <w:szCs w:val="22"/>
-        </w:rPr>
-      </w:pPr>
+          <w:bCs/>
+          <w:sz w:val="22"/>
+          <w:szCs w:val="22"/>
+        </w:rPr>
+      </w:pPr>
+      <w:r>
+        <w:rPr>
+          <w:rFonts w:ascii="Times New Roman" w:hAnsi="Times New Roman" w:cs="Times New Roman"/>
+          <w:sz w:val="22"/>
+          <w:szCs w:val="22"/>
+        </w:rPr>
+        <w:t xml:space="preserve">PSY 292C </w:t>
+      </w:r>
+      <w:r>
+        <w:rPr>
+          <w:rFonts w:ascii="Times New Roman" w:hAnsi="Times New Roman" w:cs="Times New Roman"/>
+          <w:bCs/>
+          <w:sz w:val="22"/>
+          <w:szCs w:val="22"/>
+        </w:rPr>
+        <w:t>– Controversial Issues in Psychology</w:t>
+      </w:r>
+      <w:r>
+        <w:rPr>
+          <w:rFonts w:ascii="Times New Roman" w:hAnsi="Times New Roman" w:cs="Times New Roman"/>
+          <w:bCs/>
+          <w:sz w:val="22"/>
+          <w:szCs w:val="22"/>
+        </w:rPr>
+        <w:t xml:space="preserve"> </w:t>
+      </w:r>
+      <w:r>
+        <w:rPr>
+          <w:rFonts w:ascii="Times New Roman" w:hAnsi="Times New Roman" w:cs="Times New Roman"/>
+          <w:bCs/>
+          <w:sz w:val="22"/>
+          <w:szCs w:val="22"/>
+        </w:rPr>
+        <w:tab/>
+      </w:r>
+      <w:r>
+        <w:rPr>
+          <w:rFonts w:ascii="Times New Roman" w:hAnsi="Times New Roman" w:cs="Times New Roman"/>
+          <w:bCs/>
+          <w:sz w:val="22"/>
+          <w:szCs w:val="22"/>
+        </w:rPr>
+        <w:tab/>
+      </w:r>
+      <w:r>
+        <w:rPr>
+          <w:rFonts w:ascii="Times New Roman" w:hAnsi="Times New Roman" w:cs="Times New Roman"/>
+          <w:bCs/>
+          <w:sz w:val="22"/>
+          <w:szCs w:val="22"/>
+        </w:rPr>
+        <w:tab/>
+      </w:r>
+      <w:r>
+        <w:rPr>
+          <w:rFonts w:ascii="Times New Roman" w:hAnsi="Times New Roman" w:cs="Times New Roman"/>
+          <w:bCs/>
+          <w:sz w:val="22"/>
+          <w:szCs w:val="22"/>
+        </w:rPr>
+        <w:tab/>
+      </w:r>
+      <w:r>
+        <w:rPr>
+          <w:rFonts w:ascii="Times New Roman" w:hAnsi="Times New Roman" w:cs="Times New Roman"/>
+          <w:bCs/>
+          <w:sz w:val="22"/>
+          <w:szCs w:val="22"/>
+        </w:rPr>
+        <w:tab/>
+      </w:r>
+      <w:r>
+        <w:rPr>
+          <w:rFonts w:ascii="Times New Roman" w:hAnsi="Times New Roman" w:cs="Times New Roman"/>
+          <w:bCs/>
+          <w:sz w:val="22"/>
+          <w:szCs w:val="22"/>
+        </w:rPr>
+        <w:tab/>
+        <w:t xml:space="preserve">            </w:t>
+      </w:r>
+      <w:r>
+        <w:rPr>
+          <w:rFonts w:ascii="Times New Roman" w:hAnsi="Times New Roman" w:cs="Times New Roman"/>
+          <w:bCs/>
+          <w:sz w:val="22"/>
+          <w:szCs w:val="22"/>
+        </w:rPr>
+        <w:t xml:space="preserve">            </w:t>
+      </w:r>
     </w:p>
     <w:p>
       <w:pPr>
@@ -3398,23 +3692,11 @@
         </w:pBdr>
         <w:rPr>
           <w:rFonts w:ascii="Times New Roman" w:hAnsi="Times New Roman" w:cs="Times New Roman"/>
-          <w:b/>
-          <w:bCs/>
-          <w:sz w:val="22"/>
-          <w:szCs w:val="22"/>
-        </w:rPr>
-      </w:pPr>
-      <w:r>
-        <w:rPr>
-          <w:rFonts w:ascii="Times New Roman" w:hAnsi="Times New Roman" w:cs="Times New Roman"/>
-          <w:b/>
-          <w:bCs/>
-          <w:sz w:val="22"/>
-          <w:szCs w:val="22"/>
-        </w:rPr>
-        <w:lastRenderedPageBreak/>
-        <w:t>Instructor</w:t>
-      </w:r>
+          <w:bCs/>
+          <w:sz w:val="22"/>
+          <w:szCs w:val="22"/>
+        </w:rPr>
+      </w:pPr>
     </w:p>
     <w:p>
       <w:pPr>
@@ -3431,19 +3713,25 @@
       <w:r>
         <w:rPr>
           <w:rFonts w:ascii="Times New Roman" w:hAnsi="Times New Roman" w:cs="Times New Roman"/>
-          <w:sz w:val="22"/>
-          <w:szCs w:val="22"/>
-        </w:rPr>
-        <w:t xml:space="preserve">PSY 292C </w:t>
-      </w:r>
-      <w:r>
-        <w:rPr>
-          <w:rFonts w:ascii="Times New Roman" w:hAnsi="Times New Roman" w:cs="Times New Roman"/>
-          <w:bCs/>
-          <w:sz w:val="22"/>
-          <w:szCs w:val="22"/>
-        </w:rPr>
-        <w:t>– Controversial Issues in Psychology</w:t>
+          <w:bCs/>
+          <w:i/>
+          <w:iCs/>
+          <w:sz w:val="22"/>
+          <w:szCs w:val="22"/>
+        </w:rPr>
+        <w:lastRenderedPageBreak/>
+        <w:t>Responsibilities</w:t>
+      </w:r>
+      <w:r>
+        <w:rPr>
+          <w:rFonts w:ascii="Times New Roman" w:hAnsi="Times New Roman" w:cs="Times New Roman"/>
+          <w:bCs/>
+          <w:i/>
+          <w:iCs/>
+          <w:sz w:val="22"/>
+          <w:szCs w:val="22"/>
+        </w:rPr>
+        <w:t>:</w:t>
       </w:r>
       <w:r>
         <w:rPr>
@@ -3461,71 +3749,169 @@
           <w:sz w:val="22"/>
           <w:szCs w:val="22"/>
         </w:rPr>
-        <w:tab/>
-      </w:r>
-      <w:r>
-        <w:rPr>
-          <w:rFonts w:ascii="Times New Roman" w:hAnsi="Times New Roman" w:cs="Times New Roman"/>
-          <w:bCs/>
-          <w:sz w:val="22"/>
-          <w:szCs w:val="22"/>
-        </w:rPr>
-        <w:tab/>
-      </w:r>
-      <w:r>
-        <w:rPr>
-          <w:rFonts w:ascii="Times New Roman" w:hAnsi="Times New Roman" w:cs="Times New Roman"/>
-          <w:bCs/>
-          <w:sz w:val="22"/>
-          <w:szCs w:val="22"/>
-        </w:rPr>
-        <w:tab/>
-      </w:r>
-      <w:r>
-        <w:rPr>
-          <w:rFonts w:ascii="Times New Roman" w:hAnsi="Times New Roman" w:cs="Times New Roman"/>
-          <w:bCs/>
-          <w:sz w:val="22"/>
-          <w:szCs w:val="22"/>
-        </w:rPr>
-        <w:tab/>
-      </w:r>
-      <w:r>
-        <w:rPr>
-          <w:rFonts w:ascii="Times New Roman" w:hAnsi="Times New Roman" w:cs="Times New Roman"/>
-          <w:bCs/>
-          <w:sz w:val="22"/>
-          <w:szCs w:val="22"/>
-        </w:rPr>
-        <w:tab/>
-      </w:r>
-      <w:r>
-        <w:rPr>
-          <w:rFonts w:ascii="Times New Roman" w:hAnsi="Times New Roman" w:cs="Times New Roman"/>
-          <w:bCs/>
-          <w:sz w:val="22"/>
-          <w:szCs w:val="22"/>
-        </w:rPr>
-        <w:tab/>
-        <w:t xml:space="preserve">            </w:t>
-      </w:r>
-      <w:r>
-        <w:rPr>
-          <w:rFonts w:ascii="Times New Roman" w:hAnsi="Times New Roman" w:cs="Times New Roman"/>
-          <w:bCs/>
-          <w:sz w:val="22"/>
-          <w:szCs w:val="22"/>
-        </w:rPr>
-        <w:t xml:space="preserve">            </w:t>
-      </w:r>
-      <w:r>
-        <w:rPr>
-          <w:rFonts w:ascii="Times New Roman" w:hAnsi="Times New Roman" w:cs="Times New Roman"/>
-          <w:bCs/>
-          <w:sz w:val="22"/>
-          <w:szCs w:val="22"/>
-        </w:rPr>
-        <w:t>Fall 2024</w:t>
+        <w:t xml:space="preserve">In my role as an instructor, I </w:t>
+      </w:r>
+      <w:r>
+        <w:rPr>
+          <w:rFonts w:ascii="Times New Roman" w:hAnsi="Times New Roman" w:cs="Times New Roman"/>
+          <w:bCs/>
+          <w:sz w:val="22"/>
+          <w:szCs w:val="22"/>
+        </w:rPr>
+        <w:t xml:space="preserve">created </w:t>
+      </w:r>
+      <w:r>
+        <w:rPr>
+          <w:rFonts w:ascii="Times New Roman" w:hAnsi="Times New Roman" w:cs="Times New Roman"/>
+          <w:bCs/>
+          <w:sz w:val="22"/>
+          <w:szCs w:val="22"/>
+        </w:rPr>
+        <w:t>a welcoming environment where students fe</w:t>
+      </w:r>
+      <w:r>
+        <w:rPr>
+          <w:rFonts w:ascii="Times New Roman" w:hAnsi="Times New Roman" w:cs="Times New Roman"/>
+          <w:bCs/>
+          <w:sz w:val="22"/>
+          <w:szCs w:val="22"/>
+        </w:rPr>
+        <w:t>lt</w:t>
+      </w:r>
+      <w:r>
+        <w:rPr>
+          <w:rFonts w:ascii="Times New Roman" w:hAnsi="Times New Roman" w:cs="Times New Roman"/>
+          <w:bCs/>
+          <w:sz w:val="22"/>
+          <w:szCs w:val="22"/>
+        </w:rPr>
+        <w:t xml:space="preserve"> comfortable sharing their opinions on challenging topics. My focus </w:t>
+      </w:r>
+      <w:r>
+        <w:rPr>
+          <w:rFonts w:ascii="Times New Roman" w:hAnsi="Times New Roman" w:cs="Times New Roman"/>
+          <w:bCs/>
+          <w:sz w:val="22"/>
+          <w:szCs w:val="22"/>
+        </w:rPr>
+        <w:t>during</w:t>
+      </w:r>
+      <w:r>
+        <w:rPr>
+          <w:rFonts w:ascii="Times New Roman" w:hAnsi="Times New Roman" w:cs="Times New Roman"/>
+          <w:bCs/>
+          <w:sz w:val="22"/>
+          <w:szCs w:val="22"/>
+        </w:rPr>
+        <w:t xml:space="preserve"> this course </w:t>
+      </w:r>
+      <w:r>
+        <w:rPr>
+          <w:rFonts w:ascii="Times New Roman" w:hAnsi="Times New Roman" w:cs="Times New Roman"/>
+          <w:bCs/>
+          <w:sz w:val="22"/>
+          <w:szCs w:val="22"/>
+        </w:rPr>
+        <w:t>wa</w:t>
+      </w:r>
+      <w:r>
+        <w:rPr>
+          <w:rFonts w:ascii="Times New Roman" w:hAnsi="Times New Roman" w:cs="Times New Roman"/>
+          <w:bCs/>
+          <w:sz w:val="22"/>
+          <w:szCs w:val="22"/>
+        </w:rPr>
+        <w:t>s for students to develop a framework that w</w:t>
+      </w:r>
+      <w:r>
+        <w:rPr>
+          <w:rFonts w:ascii="Times New Roman" w:hAnsi="Times New Roman" w:cs="Times New Roman"/>
+          <w:bCs/>
+          <w:sz w:val="22"/>
+          <w:szCs w:val="22"/>
+        </w:rPr>
+        <w:t>ould</w:t>
+      </w:r>
+      <w:r>
+        <w:rPr>
+          <w:rFonts w:ascii="Times New Roman" w:hAnsi="Times New Roman" w:cs="Times New Roman"/>
+          <w:bCs/>
+          <w:sz w:val="22"/>
+          <w:szCs w:val="22"/>
+        </w:rPr>
+        <w:t xml:space="preserve"> allow </w:t>
+      </w:r>
+      <w:r>
+        <w:rPr>
+          <w:rFonts w:ascii="Times New Roman" w:hAnsi="Times New Roman" w:cs="Times New Roman"/>
+          <w:bCs/>
+          <w:sz w:val="22"/>
+          <w:szCs w:val="22"/>
+        </w:rPr>
+        <w:t>them</w:t>
+      </w:r>
+      <w:r>
+        <w:rPr>
+          <w:rFonts w:ascii="Times New Roman" w:hAnsi="Times New Roman" w:cs="Times New Roman"/>
+          <w:bCs/>
+          <w:sz w:val="22"/>
+          <w:szCs w:val="22"/>
+        </w:rPr>
+        <w:t xml:space="preserve"> to dissect difficult psychological topics, debunk common myths, and become masters </w:t>
+      </w:r>
+      <w:r>
+        <w:rPr>
+          <w:rFonts w:ascii="Times New Roman" w:hAnsi="Times New Roman" w:cs="Times New Roman"/>
+          <w:bCs/>
+          <w:sz w:val="22"/>
+          <w:szCs w:val="22"/>
+        </w:rPr>
+        <w:t>of</w:t>
+      </w:r>
+      <w:r>
+        <w:rPr>
+          <w:rFonts w:ascii="Times New Roman" w:hAnsi="Times New Roman" w:cs="Times New Roman"/>
+          <w:bCs/>
+          <w:sz w:val="22"/>
+          <w:szCs w:val="22"/>
+        </w:rPr>
+        <w:t xml:space="preserve"> APA format. I </w:t>
+      </w:r>
+      <w:r>
+        <w:rPr>
+          <w:rFonts w:ascii="Times New Roman" w:hAnsi="Times New Roman" w:cs="Times New Roman"/>
+          <w:bCs/>
+          <w:sz w:val="22"/>
+          <w:szCs w:val="22"/>
+        </w:rPr>
+        <w:t>was</w:t>
+      </w:r>
+      <w:r>
+        <w:rPr>
+          <w:rFonts w:ascii="Times New Roman" w:hAnsi="Times New Roman" w:cs="Times New Roman"/>
+          <w:bCs/>
+          <w:sz w:val="22"/>
+          <w:szCs w:val="22"/>
+        </w:rPr>
+        <w:t xml:space="preserve"> also responsible for facilitating class discussions, creating and grading assignments, and adjusting course materials </w:t>
+      </w:r>
+      <w:r>
+        <w:rPr>
+          <w:rFonts w:ascii="Times New Roman" w:hAnsi="Times New Roman" w:cs="Times New Roman"/>
+          <w:bCs/>
+          <w:sz w:val="22"/>
+          <w:szCs w:val="22"/>
+        </w:rPr>
+        <w:t>the interests of my 10</w:t>
+      </w:r>
+      <w:r>
+        <w:rPr>
+          <w:rFonts w:ascii="Times New Roman" w:hAnsi="Times New Roman" w:cs="Times New Roman"/>
+          <w:bCs/>
+          <w:sz w:val="22"/>
+          <w:szCs w:val="22"/>
+        </w:rPr>
+        <w:t xml:space="preserve"> students.</w:t>
       </w:r>
     </w:p>
     <w:p>
@@ -3535,6 +3921,7 @@
         </w:pBdr>
         <w:rPr>
           <w:rFonts w:ascii="Times New Roman" w:hAnsi="Times New Roman" w:cs="Times New Roman"/>
+          <w:b/>
           <w:bCs/>
           <w:sz w:val="22"/>
           <w:szCs w:val="22"/>
@@ -3548,32 +3935,21 @@
         </w:pBdr>
         <w:rPr>
           <w:rFonts w:ascii="Times New Roman" w:hAnsi="Times New Roman" w:cs="Times New Roman"/>
-          <w:bCs/>
-          <w:sz w:val="22"/>
-          <w:szCs w:val="22"/>
-        </w:rPr>
-      </w:pPr>
-      <w:r>
-        <w:rPr>
-          <w:rFonts w:ascii="Times New Roman" w:hAnsi="Times New Roman" w:cs="Times New Roman"/>
-          <w:bCs/>
-          <w:i/>
-          <w:iCs/>
-          <w:sz w:val="22"/>
-          <w:szCs w:val="22"/>
-        </w:rPr>
-        <w:t>Responsibilities</w:t>
-      </w:r>
-      <w:r>
-        <w:rPr>
-          <w:rFonts w:ascii="Times New Roman" w:hAnsi="Times New Roman" w:cs="Times New Roman"/>
-          <w:bCs/>
-          <w:i/>
-          <w:iCs/>
-          <w:sz w:val="22"/>
-          <w:szCs w:val="22"/>
-        </w:rPr>
-        <w:t>:</w:t>
+          <w:b/>
+          <w:bCs/>
+          <w:sz w:val="22"/>
+          <w:szCs w:val="22"/>
+        </w:rPr>
+      </w:pPr>
+      <w:r>
+        <w:rPr>
+          <w:rFonts w:ascii="Times New Roman" w:hAnsi="Times New Roman" w:cs="Times New Roman"/>
+          <w:b/>
+          <w:bCs/>
+          <w:sz w:val="22"/>
+          <w:szCs w:val="22"/>
+        </w:rPr>
+        <w:t>Teaching Assistant</w:t>
       </w:r>
       <w:r>
         <w:rPr>
@@ -3591,169 +3967,71 @@
           <w:sz w:val="22"/>
           <w:szCs w:val="22"/>
         </w:rPr>
-        <w:t xml:space="preserve">In my role as an instructor, I </w:t>
-      </w:r>
-      <w:r>
-        <w:rPr>
-          <w:rFonts w:ascii="Times New Roman" w:hAnsi="Times New Roman" w:cs="Times New Roman"/>
-          <w:bCs/>
-          <w:sz w:val="22"/>
-          <w:szCs w:val="22"/>
-        </w:rPr>
-        <w:t xml:space="preserve">created </w:t>
-      </w:r>
-      <w:r>
-        <w:rPr>
-          <w:rFonts w:ascii="Times New Roman" w:hAnsi="Times New Roman" w:cs="Times New Roman"/>
-          <w:bCs/>
-          <w:sz w:val="22"/>
-          <w:szCs w:val="22"/>
-        </w:rPr>
-        <w:t>a welcoming environment where students fe</w:t>
-      </w:r>
-      <w:r>
-        <w:rPr>
-          <w:rFonts w:ascii="Times New Roman" w:hAnsi="Times New Roman" w:cs="Times New Roman"/>
-          <w:bCs/>
-          <w:sz w:val="22"/>
-          <w:szCs w:val="22"/>
-        </w:rPr>
-        <w:t>lt</w:t>
-      </w:r>
-      <w:r>
-        <w:rPr>
-          <w:rFonts w:ascii="Times New Roman" w:hAnsi="Times New Roman" w:cs="Times New Roman"/>
-          <w:bCs/>
-          <w:sz w:val="22"/>
-          <w:szCs w:val="22"/>
-        </w:rPr>
-        <w:t xml:space="preserve"> comfortable sharing their opinions on challenging topics. My focus </w:t>
-      </w:r>
-      <w:r>
-        <w:rPr>
-          <w:rFonts w:ascii="Times New Roman" w:hAnsi="Times New Roman" w:cs="Times New Roman"/>
-          <w:bCs/>
-          <w:sz w:val="22"/>
-          <w:szCs w:val="22"/>
-        </w:rPr>
-        <w:t>during</w:t>
-      </w:r>
-      <w:r>
-        <w:rPr>
-          <w:rFonts w:ascii="Times New Roman" w:hAnsi="Times New Roman" w:cs="Times New Roman"/>
-          <w:bCs/>
-          <w:sz w:val="22"/>
-          <w:szCs w:val="22"/>
-        </w:rPr>
-        <w:t xml:space="preserve"> this course </w:t>
-      </w:r>
-      <w:r>
-        <w:rPr>
-          <w:rFonts w:ascii="Times New Roman" w:hAnsi="Times New Roman" w:cs="Times New Roman"/>
-          <w:bCs/>
-          <w:sz w:val="22"/>
-          <w:szCs w:val="22"/>
-        </w:rPr>
-        <w:t>wa</w:t>
-      </w:r>
-      <w:r>
-        <w:rPr>
-          <w:rFonts w:ascii="Times New Roman" w:hAnsi="Times New Roman" w:cs="Times New Roman"/>
-          <w:bCs/>
-          <w:sz w:val="22"/>
-          <w:szCs w:val="22"/>
-        </w:rPr>
-        <w:t>s for students to develop a framework that w</w:t>
-      </w:r>
-      <w:r>
-        <w:rPr>
-          <w:rFonts w:ascii="Times New Roman" w:hAnsi="Times New Roman" w:cs="Times New Roman"/>
-          <w:bCs/>
-          <w:sz w:val="22"/>
-          <w:szCs w:val="22"/>
-        </w:rPr>
-        <w:t>ould</w:t>
-      </w:r>
-      <w:r>
-        <w:rPr>
-          <w:rFonts w:ascii="Times New Roman" w:hAnsi="Times New Roman" w:cs="Times New Roman"/>
-          <w:bCs/>
-          <w:sz w:val="22"/>
-          <w:szCs w:val="22"/>
-        </w:rPr>
-        <w:t xml:space="preserve"> allow </w:t>
-      </w:r>
-      <w:r>
-        <w:rPr>
-          <w:rFonts w:ascii="Times New Roman" w:hAnsi="Times New Roman" w:cs="Times New Roman"/>
-          <w:bCs/>
-          <w:sz w:val="22"/>
-          <w:szCs w:val="22"/>
-        </w:rPr>
-        <w:t>them</w:t>
-      </w:r>
-      <w:r>
-        <w:rPr>
-          <w:rFonts w:ascii="Times New Roman" w:hAnsi="Times New Roman" w:cs="Times New Roman"/>
-          <w:bCs/>
-          <w:sz w:val="22"/>
-          <w:szCs w:val="22"/>
-        </w:rPr>
-        <w:t xml:space="preserve"> to dissect difficult psychological topics, debunk common myths, and become masters </w:t>
-      </w:r>
-      <w:r>
-        <w:rPr>
-          <w:rFonts w:ascii="Times New Roman" w:hAnsi="Times New Roman" w:cs="Times New Roman"/>
-          <w:bCs/>
-          <w:sz w:val="22"/>
-          <w:szCs w:val="22"/>
-        </w:rPr>
-        <w:t>of</w:t>
-      </w:r>
-      <w:r>
-        <w:rPr>
-          <w:rFonts w:ascii="Times New Roman" w:hAnsi="Times New Roman" w:cs="Times New Roman"/>
-          <w:bCs/>
-          <w:sz w:val="22"/>
-          <w:szCs w:val="22"/>
-        </w:rPr>
-        <w:t xml:space="preserve"> APA format. I </w:t>
-      </w:r>
-      <w:r>
-        <w:rPr>
-          <w:rFonts w:ascii="Times New Roman" w:hAnsi="Times New Roman" w:cs="Times New Roman"/>
-          <w:bCs/>
-          <w:sz w:val="22"/>
-          <w:szCs w:val="22"/>
-        </w:rPr>
-        <w:t>was</w:t>
-      </w:r>
-      <w:r>
-        <w:rPr>
-          <w:rFonts w:ascii="Times New Roman" w:hAnsi="Times New Roman" w:cs="Times New Roman"/>
-          <w:bCs/>
-          <w:sz w:val="22"/>
-          <w:szCs w:val="22"/>
-        </w:rPr>
-        <w:t xml:space="preserve"> also responsible for facilitating class discussions, creating and grading assignments, and adjusting course materials </w:t>
-      </w:r>
-      <w:r>
-        <w:rPr>
-          <w:rFonts w:ascii="Times New Roman" w:hAnsi="Times New Roman" w:cs="Times New Roman"/>
-          <w:bCs/>
-          <w:sz w:val="22"/>
-          <w:szCs w:val="22"/>
-        </w:rPr>
-        <w:t>the interests of my 10</w:t>
-      </w:r>
-      <w:r>
-        <w:rPr>
-          <w:rFonts w:ascii="Times New Roman" w:hAnsi="Times New Roman" w:cs="Times New Roman"/>
-          <w:bCs/>
-          <w:sz w:val="22"/>
-          <w:szCs w:val="22"/>
-        </w:rPr>
-        <w:t xml:space="preserve"> students.</w:t>
+        <w:tab/>
+      </w:r>
+      <w:r>
+        <w:rPr>
+          <w:rFonts w:ascii="Times New Roman" w:hAnsi="Times New Roman" w:cs="Times New Roman"/>
+          <w:bCs/>
+          <w:sz w:val="22"/>
+          <w:szCs w:val="22"/>
+        </w:rPr>
+        <w:tab/>
+      </w:r>
+      <w:r>
+        <w:rPr>
+          <w:rFonts w:ascii="Times New Roman" w:hAnsi="Times New Roman" w:cs="Times New Roman"/>
+          <w:bCs/>
+          <w:sz w:val="22"/>
+          <w:szCs w:val="22"/>
+        </w:rPr>
+        <w:tab/>
+      </w:r>
+      <w:r>
+        <w:rPr>
+          <w:rFonts w:ascii="Times New Roman" w:hAnsi="Times New Roman" w:cs="Times New Roman"/>
+          <w:bCs/>
+          <w:sz w:val="22"/>
+          <w:szCs w:val="22"/>
+        </w:rPr>
+        <w:tab/>
+      </w:r>
+      <w:r>
+        <w:rPr>
+          <w:rFonts w:ascii="Times New Roman" w:hAnsi="Times New Roman" w:cs="Times New Roman"/>
+          <w:bCs/>
+          <w:sz w:val="22"/>
+          <w:szCs w:val="22"/>
+        </w:rPr>
+        <w:tab/>
+      </w:r>
+      <w:r>
+        <w:rPr>
+          <w:rFonts w:ascii="Times New Roman" w:hAnsi="Times New Roman" w:cs="Times New Roman"/>
+          <w:bCs/>
+          <w:sz w:val="22"/>
+          <w:szCs w:val="22"/>
+        </w:rPr>
+        <w:tab/>
+      </w:r>
+      <w:r>
+        <w:rPr>
+          <w:rFonts w:ascii="Times New Roman" w:hAnsi="Times New Roman" w:cs="Times New Roman"/>
+          <w:bCs/>
+          <w:sz w:val="22"/>
+          <w:szCs w:val="22"/>
+        </w:rPr>
+        <w:tab/>
+        <w:t xml:space="preserve">  </w:t>
+      </w:r>
+      <w:r>
+        <w:rPr>
+          <w:rFonts w:ascii="Times New Roman" w:hAnsi="Times New Roman" w:cs="Times New Roman"/>
+          <w:bCs/>
+          <w:sz w:val="22"/>
+          <w:szCs w:val="22"/>
+        </w:rPr>
+        <w:t>Spring &amp; Summer 2022, Summer 2024</w:t>
       </w:r>
     </w:p>
     <w:p>
@@ -3763,12 +4041,92 @@
         </w:pBdr>
         <w:rPr>
           <w:rFonts w:ascii="Times New Roman" w:hAnsi="Times New Roman" w:cs="Times New Roman"/>
-          <w:b/>
-          <w:bCs/>
-          <w:sz w:val="22"/>
-          <w:szCs w:val="22"/>
-        </w:rPr>
-      </w:pPr>
+          <w:bCs/>
+          <w:sz w:val="22"/>
+          <w:szCs w:val="22"/>
+        </w:rPr>
+      </w:pPr>
+      <w:r>
+        <w:rPr>
+          <w:rFonts w:ascii="Times New Roman" w:hAnsi="Times New Roman" w:cs="Times New Roman"/>
+          <w:bCs/>
+          <w:sz w:val="22"/>
+          <w:szCs w:val="22"/>
+        </w:rPr>
+        <w:t xml:space="preserve">PSY 252 – Mind, Brain, &amp; Behavior </w:t>
+      </w:r>
+      <w:r>
+        <w:rPr>
+          <w:rFonts w:ascii="Times New Roman" w:hAnsi="Times New Roman" w:cs="Times New Roman"/>
+          <w:bCs/>
+          <w:sz w:val="22"/>
+          <w:szCs w:val="22"/>
+        </w:rPr>
+        <w:tab/>
+      </w:r>
+      <w:r>
+        <w:rPr>
+          <w:rFonts w:ascii="Times New Roman" w:hAnsi="Times New Roman" w:cs="Times New Roman"/>
+          <w:bCs/>
+          <w:sz w:val="22"/>
+          <w:szCs w:val="22"/>
+        </w:rPr>
+        <w:tab/>
+      </w:r>
+      <w:r>
+        <w:rPr>
+          <w:rFonts w:ascii="Times New Roman" w:hAnsi="Times New Roman" w:cs="Times New Roman"/>
+          <w:bCs/>
+          <w:sz w:val="22"/>
+          <w:szCs w:val="22"/>
+        </w:rPr>
+        <w:tab/>
+      </w:r>
+      <w:r>
+        <w:rPr>
+          <w:rFonts w:ascii="Times New Roman" w:hAnsi="Times New Roman" w:cs="Times New Roman"/>
+          <w:bCs/>
+          <w:sz w:val="22"/>
+          <w:szCs w:val="22"/>
+        </w:rPr>
+        <w:tab/>
+      </w:r>
+      <w:r>
+        <w:rPr>
+          <w:rFonts w:ascii="Times New Roman" w:hAnsi="Times New Roman" w:cs="Times New Roman"/>
+          <w:bCs/>
+          <w:sz w:val="22"/>
+          <w:szCs w:val="22"/>
+        </w:rPr>
+        <w:t xml:space="preserve">  </w:t>
+      </w:r>
+      <w:r>
+        <w:rPr>
+          <w:rFonts w:ascii="Times New Roman" w:hAnsi="Times New Roman" w:cs="Times New Roman"/>
+          <w:bCs/>
+          <w:sz w:val="22"/>
+          <w:szCs w:val="22"/>
+        </w:rPr>
+        <w:t xml:space="preserve">       </w:t>
+      </w:r>
+      <w:r>
+        <w:rPr>
+          <w:rFonts w:ascii="Times New Roman" w:hAnsi="Times New Roman" w:cs="Times New Roman"/>
+          <w:bCs/>
+          <w:sz w:val="22"/>
+          <w:szCs w:val="22"/>
+        </w:rPr>
+        <w:t xml:space="preserve">  </w:t>
+      </w:r>
+      <w:r>
+        <w:rPr>
+          <w:rFonts w:ascii="Times New Roman" w:hAnsi="Times New Roman" w:cs="Times New Roman"/>
+          <w:bCs/>
+          <w:sz w:val="22"/>
+          <w:szCs w:val="22"/>
+        </w:rPr>
+        <w:t xml:space="preserve">    </w:t>
+      </w:r>
     </w:p>
     <w:p>
       <w:pPr>
@@ -3777,6 +4135,126 @@
         </w:pBdr>
         <w:rPr>
           <w:rFonts w:ascii="Times New Roman" w:hAnsi="Times New Roman" w:cs="Times New Roman"/>
+          <w:bCs/>
+          <w:sz w:val="22"/>
+          <w:szCs w:val="22"/>
+        </w:rPr>
+      </w:pPr>
+    </w:p>
+    <w:p>
+      <w:pPr>
+        <w:rPr>
+          <w:rFonts w:ascii="Times New Roman" w:hAnsi="Times New Roman" w:cs="Times New Roman"/>
+          <w:sz w:val="22"/>
+          <w:szCs w:val="22"/>
+        </w:rPr>
+      </w:pPr>
+      <w:r>
+        <w:rPr>
+          <w:rFonts w:ascii="Times New Roman" w:hAnsi="Times New Roman" w:cs="Times New Roman"/>
+          <w:i/>
+          <w:iCs/>
+          <w:sz w:val="22"/>
+          <w:szCs w:val="22"/>
+        </w:rPr>
+        <w:t>Responsibilities:</w:t>
+      </w:r>
+      <w:r>
+        <w:rPr>
+          <w:rFonts w:ascii="Times New Roman" w:hAnsi="Times New Roman" w:cs="Times New Roman"/>
+          <w:i/>
+          <w:iCs/>
+          <w:sz w:val="22"/>
+          <w:szCs w:val="22"/>
+        </w:rPr>
+        <w:t xml:space="preserve"> </w:t>
+      </w:r>
+      <w:r>
+        <w:rPr>
+          <w:rFonts w:ascii="Times New Roman" w:hAnsi="Times New Roman" w:cs="Times New Roman"/>
+          <w:sz w:val="22"/>
+          <w:szCs w:val="22"/>
+        </w:rPr>
+        <w:t>I</w:t>
+      </w:r>
+      <w:r>
+        <w:rPr>
+          <w:rFonts w:ascii="Times New Roman" w:hAnsi="Times New Roman" w:cs="Times New Roman"/>
+          <w:sz w:val="22"/>
+          <w:szCs w:val="22"/>
+        </w:rPr>
+        <w:t xml:space="preserve">n my role as a teaching assistant, I conducted comprehensive exam reviews to clarify concepts </w:t>
+      </w:r>
+      <w:r>
+        <w:rPr>
+          <w:rFonts w:ascii="Times New Roman" w:hAnsi="Times New Roman" w:cs="Times New Roman"/>
+          <w:sz w:val="22"/>
+          <w:szCs w:val="22"/>
+        </w:rPr>
+        <w:t>important to the course, and that would be important for later psychology courses</w:t>
+      </w:r>
+      <w:r>
+        <w:rPr>
+          <w:rFonts w:ascii="Times New Roman" w:hAnsi="Times New Roman" w:cs="Times New Roman"/>
+          <w:sz w:val="22"/>
+          <w:szCs w:val="22"/>
+        </w:rPr>
+        <w:t xml:space="preserve">, integrating knowledge from upper-division psychology courses and lab experience. Additionally, I was tasked with efficiently grading assignments and tests while providing constructive feedback to support student </w:t>
+      </w:r>
+      <w:r>
+        <w:rPr>
+          <w:rFonts w:ascii="Times New Roman" w:hAnsi="Times New Roman" w:cs="Times New Roman"/>
+          <w:sz w:val="22"/>
+          <w:szCs w:val="22"/>
+        </w:rPr>
+        <w:t>growth</w:t>
+      </w:r>
+      <w:r>
+        <w:rPr>
+          <w:rFonts w:ascii="Times New Roman" w:hAnsi="Times New Roman" w:cs="Times New Roman"/>
+          <w:sz w:val="22"/>
+          <w:szCs w:val="22"/>
+        </w:rPr>
+        <w:t xml:space="preserve"> and</w:t>
+      </w:r>
+      <w:r>
+        <w:rPr>
+          <w:rFonts w:ascii="Times New Roman" w:hAnsi="Times New Roman" w:cs="Times New Roman"/>
+          <w:sz w:val="22"/>
+          <w:szCs w:val="22"/>
+        </w:rPr>
+        <w:t xml:space="preserve"> regularly attending class to build strong relationships with </w:t>
+      </w:r>
+      <w:r>
+        <w:rPr>
+          <w:rFonts w:ascii="Times New Roman" w:hAnsi="Times New Roman" w:cs="Times New Roman"/>
+          <w:sz w:val="22"/>
+          <w:szCs w:val="22"/>
+        </w:rPr>
+        <w:t xml:space="preserve"> courses of roughly 100 </w:t>
+      </w:r>
+      <w:r>
+        <w:rPr>
+          <w:rFonts w:ascii="Times New Roman" w:hAnsi="Times New Roman" w:cs="Times New Roman"/>
+          <w:sz w:val="22"/>
+          <w:szCs w:val="22"/>
+        </w:rPr>
+        <w:t xml:space="preserve">students. </w:t>
+      </w:r>
+    </w:p>
+    <w:p>
+      <w:pPr>
+        <w:rPr>
+          <w:rFonts w:ascii="Times New Roman" w:hAnsi="Times New Roman" w:cs="Times New Roman"/>
+          <w:sz w:val="22"/>
+          <w:szCs w:val="22"/>
+        </w:rPr>
+      </w:pPr>
+    </w:p>
+    <w:p>
+      <w:pPr>
+        <w:rPr>
+          <w:rFonts w:ascii="Times New Roman" w:hAnsi="Times New Roman" w:cs="Times New Roman"/>
           <w:b/>
           <w:bCs/>
           <w:sz w:val="22"/>
@@ -3793,173 +4271,9 @@
         </w:rPr>
         <w:t>Teaching Assistant</w:t>
       </w:r>
-    </w:p>
-    <w:p>
-      <w:pPr>
-        <w:pBdr>
-          <w:top w:val="single" w:sz="4" w:space="1" w:color="auto"/>
-        </w:pBdr>
-        <w:rPr>
-          <w:rFonts w:ascii="Times New Roman" w:hAnsi="Times New Roman" w:cs="Times New Roman"/>
-          <w:bCs/>
-          <w:sz w:val="22"/>
-          <w:szCs w:val="22"/>
-        </w:rPr>
-      </w:pPr>
-      <w:r>
-        <w:rPr>
-          <w:rFonts w:ascii="Times New Roman" w:hAnsi="Times New Roman" w:cs="Times New Roman"/>
-          <w:bCs/>
-          <w:sz w:val="22"/>
-          <w:szCs w:val="22"/>
-        </w:rPr>
-        <w:t xml:space="preserve">PSY 252 – Mind, Brain, &amp; Behavior </w:t>
-      </w:r>
-      <w:r>
-        <w:rPr>
-          <w:rFonts w:ascii="Times New Roman" w:hAnsi="Times New Roman" w:cs="Times New Roman"/>
-          <w:bCs/>
-          <w:sz w:val="22"/>
-          <w:szCs w:val="22"/>
-        </w:rPr>
-        <w:tab/>
-      </w:r>
-      <w:r>
-        <w:rPr>
-          <w:rFonts w:ascii="Times New Roman" w:hAnsi="Times New Roman" w:cs="Times New Roman"/>
-          <w:bCs/>
-          <w:sz w:val="22"/>
-          <w:szCs w:val="22"/>
-        </w:rPr>
-        <w:tab/>
-      </w:r>
-      <w:r>
-        <w:rPr>
-          <w:rFonts w:ascii="Times New Roman" w:hAnsi="Times New Roman" w:cs="Times New Roman"/>
-          <w:bCs/>
-          <w:sz w:val="22"/>
-          <w:szCs w:val="22"/>
-        </w:rPr>
-        <w:tab/>
-      </w:r>
-      <w:r>
-        <w:rPr>
-          <w:rFonts w:ascii="Times New Roman" w:hAnsi="Times New Roman" w:cs="Times New Roman"/>
-          <w:bCs/>
-          <w:sz w:val="22"/>
-          <w:szCs w:val="22"/>
-        </w:rPr>
-        <w:tab/>
-      </w:r>
-      <w:r>
-        <w:rPr>
-          <w:rFonts w:ascii="Times New Roman" w:hAnsi="Times New Roman" w:cs="Times New Roman"/>
-          <w:bCs/>
-          <w:sz w:val="22"/>
-          <w:szCs w:val="22"/>
-        </w:rPr>
-        <w:t xml:space="preserve">  </w:t>
-      </w:r>
-      <w:r>
-        <w:rPr>
-          <w:rFonts w:ascii="Times New Roman" w:hAnsi="Times New Roman" w:cs="Times New Roman"/>
-          <w:bCs/>
-          <w:sz w:val="22"/>
-          <w:szCs w:val="22"/>
-        </w:rPr>
-        <w:t xml:space="preserve">       </w:t>
-      </w:r>
-      <w:r>
-        <w:rPr>
-          <w:rFonts w:ascii="Times New Roman" w:hAnsi="Times New Roman" w:cs="Times New Roman"/>
-          <w:bCs/>
-          <w:sz w:val="22"/>
-          <w:szCs w:val="22"/>
-        </w:rPr>
-        <w:t xml:space="preserve">  </w:t>
-      </w:r>
-      <w:r>
-        <w:rPr>
-          <w:rFonts w:ascii="Times New Roman" w:hAnsi="Times New Roman" w:cs="Times New Roman"/>
-          <w:bCs/>
-          <w:sz w:val="22"/>
-          <w:szCs w:val="22"/>
-        </w:rPr>
-        <w:t xml:space="preserve">    </w:t>
-      </w:r>
-      <w:r>
-        <w:rPr>
-          <w:rFonts w:ascii="Times New Roman" w:hAnsi="Times New Roman" w:cs="Times New Roman"/>
-          <w:bCs/>
-          <w:sz w:val="22"/>
-          <w:szCs w:val="22"/>
-        </w:rPr>
-        <w:t>Spring</w:t>
-      </w:r>
-      <w:r>
-        <w:rPr>
-          <w:rFonts w:ascii="Times New Roman" w:hAnsi="Times New Roman" w:cs="Times New Roman"/>
-          <w:bCs/>
-          <w:sz w:val="22"/>
-          <w:szCs w:val="22"/>
-        </w:rPr>
-        <w:t xml:space="preserve"> &amp; </w:t>
-      </w:r>
-      <w:r>
-        <w:rPr>
-          <w:rFonts w:ascii="Times New Roman" w:hAnsi="Times New Roman" w:cs="Times New Roman"/>
-          <w:bCs/>
-          <w:sz w:val="22"/>
-          <w:szCs w:val="22"/>
-        </w:rPr>
-        <w:t>Summer 2022</w:t>
-      </w:r>
-      <w:r>
-        <w:rPr>
-          <w:rFonts w:ascii="Times New Roman" w:hAnsi="Times New Roman" w:cs="Times New Roman"/>
-          <w:bCs/>
-          <w:sz w:val="22"/>
-          <w:szCs w:val="22"/>
-        </w:rPr>
-        <w:t>, Summer 2024</w:t>
-      </w:r>
-    </w:p>
-    <w:p>
-      <w:pPr>
-        <w:pBdr>
-          <w:top w:val="single" w:sz="4" w:space="1" w:color="auto"/>
-        </w:pBdr>
-        <w:rPr>
-          <w:rFonts w:ascii="Times New Roman" w:hAnsi="Times New Roman" w:cs="Times New Roman"/>
-          <w:bCs/>
-          <w:sz w:val="22"/>
-          <w:szCs w:val="22"/>
-        </w:rPr>
-      </w:pPr>
-    </w:p>
-    <w:p>
-      <w:pPr>
-        <w:rPr>
-          <w:rFonts w:ascii="Times New Roman" w:hAnsi="Times New Roman" w:cs="Times New Roman"/>
-          <w:sz w:val="22"/>
-          <w:szCs w:val="22"/>
-        </w:rPr>
-      </w:pPr>
-      <w:r>
-        <w:rPr>
-          <w:rFonts w:ascii="Times New Roman" w:hAnsi="Times New Roman" w:cs="Times New Roman"/>
-          <w:i/>
-          <w:iCs/>
-          <w:sz w:val="22"/>
-          <w:szCs w:val="22"/>
-        </w:rPr>
-        <w:t>Responsibilities:</w:t>
-      </w:r>
-      <w:r>
-        <w:rPr>
-          <w:rFonts w:ascii="Times New Roman" w:hAnsi="Times New Roman" w:cs="Times New Roman"/>
-          <w:i/>
-          <w:iCs/>
+      <w:r>
+        <w:rPr>
+          <w:rFonts w:ascii="Times New Roman" w:hAnsi="Times New Roman" w:cs="Times New Roman"/>
           <w:sz w:val="22"/>
           <w:szCs w:val="22"/>
         </w:rPr>
@@ -3971,6 +4285,112 @@
           <w:sz w:val="22"/>
           <w:szCs w:val="22"/>
         </w:rPr>
+        <w:tab/>
+      </w:r>
+      <w:r>
+        <w:rPr>
+          <w:rFonts w:ascii="Times New Roman" w:hAnsi="Times New Roman" w:cs="Times New Roman"/>
+          <w:sz w:val="22"/>
+          <w:szCs w:val="22"/>
+        </w:rPr>
+        <w:tab/>
+      </w:r>
+      <w:r>
+        <w:rPr>
+          <w:rFonts w:ascii="Times New Roman" w:hAnsi="Times New Roman" w:cs="Times New Roman"/>
+          <w:sz w:val="22"/>
+          <w:szCs w:val="22"/>
+        </w:rPr>
+        <w:tab/>
+      </w:r>
+      <w:r>
+        <w:rPr>
+          <w:rFonts w:ascii="Times New Roman" w:hAnsi="Times New Roman" w:cs="Times New Roman"/>
+          <w:sz w:val="22"/>
+          <w:szCs w:val="22"/>
+        </w:rPr>
+        <w:tab/>
+      </w:r>
+      <w:r>
+        <w:rPr>
+          <w:rFonts w:ascii="Times New Roman" w:hAnsi="Times New Roman" w:cs="Times New Roman"/>
+          <w:sz w:val="22"/>
+          <w:szCs w:val="22"/>
+        </w:rPr>
+        <w:tab/>
+      </w:r>
+      <w:r>
+        <w:rPr>
+          <w:rFonts w:ascii="Times New Roman" w:hAnsi="Times New Roman" w:cs="Times New Roman"/>
+          <w:sz w:val="22"/>
+          <w:szCs w:val="22"/>
+        </w:rPr>
+        <w:tab/>
+      </w:r>
+      <w:r>
+        <w:rPr>
+          <w:rFonts w:ascii="Times New Roman" w:hAnsi="Times New Roman" w:cs="Times New Roman"/>
+          <w:sz w:val="22"/>
+          <w:szCs w:val="22"/>
+        </w:rPr>
+        <w:tab/>
+      </w:r>
+      <w:r>
+        <w:rPr>
+          <w:rFonts w:ascii="Times New Roman" w:hAnsi="Times New Roman" w:cs="Times New Roman"/>
+          <w:sz w:val="22"/>
+          <w:szCs w:val="22"/>
+        </w:rPr>
+        <w:tab/>
+      </w:r>
+      <w:r>
+        <w:rPr>
+          <w:rFonts w:ascii="Times New Roman" w:hAnsi="Times New Roman" w:cs="Times New Roman"/>
+          <w:sz w:val="22"/>
+          <w:szCs w:val="22"/>
+        </w:rPr>
+        <w:tab/>
+      </w:r>
+      <w:r>
+        <w:rPr>
+          <w:rFonts w:ascii="Times New Roman" w:hAnsi="Times New Roman" w:cs="Times New Roman"/>
+          <w:sz w:val="22"/>
+          <w:szCs w:val="22"/>
+        </w:rPr>
+        <w:tab/>
+        <w:t xml:space="preserve">          </w:t>
+      </w:r>
+      <w:r>
+        <w:rPr>
+          <w:rFonts w:ascii="Times New Roman" w:hAnsi="Times New Roman" w:cs="Times New Roman"/>
+          <w:sz w:val="22"/>
+          <w:szCs w:val="22"/>
+        </w:rPr>
+        <w:t>Fall 2022</w:t>
+      </w:r>
+    </w:p>
+    <w:p>
+      <w:pPr>
+        <w:rPr>
+          <w:rFonts w:ascii="Times New Roman" w:hAnsi="Times New Roman" w:cs="Times New Roman"/>
+          <w:sz w:val="22"/>
+          <w:szCs w:val="22"/>
+        </w:rPr>
+      </w:pPr>
+      <w:r>
+        <w:rPr>
+          <w:rFonts w:ascii="Times New Roman" w:hAnsi="Times New Roman" w:cs="Times New Roman"/>
+          <w:sz w:val="22"/>
+          <w:szCs w:val="22"/>
+        </w:rPr>
+        <w:t xml:space="preserve">PSY 250 – Research Design &amp; Analysis </w:t>
+      </w:r>
+      <w:r>
+        <w:rPr>
+          <w:rFonts w:ascii="Times New Roman" w:hAnsi="Times New Roman" w:cs="Times New Roman"/>
+          <w:sz w:val="22"/>
+          <w:szCs w:val="22"/>
+        </w:rPr>
         <w:t>I</w:t>
       </w:r>
       <w:r>
@@ -3979,125 +4399,6 @@
           <w:sz w:val="22"/>
           <w:szCs w:val="22"/>
         </w:rPr>
-        <w:t xml:space="preserve">n my role as a teaching assistant, I conducted comprehensive exam reviews to clarify concepts </w:t>
-      </w:r>
-      <w:r>
-        <w:rPr>
-          <w:rFonts w:ascii="Times New Roman" w:hAnsi="Times New Roman" w:cs="Times New Roman"/>
-          <w:sz w:val="22"/>
-          <w:szCs w:val="22"/>
-        </w:rPr>
-        <w:t>important to the course, and that would be important for later psychology courses</w:t>
-      </w:r>
-      <w:r>
-        <w:rPr>
-          <w:rFonts w:ascii="Times New Roman" w:hAnsi="Times New Roman" w:cs="Times New Roman"/>
-          <w:sz w:val="22"/>
-          <w:szCs w:val="22"/>
-        </w:rPr>
-        <w:t xml:space="preserve">, integrating knowledge from upper-division psychology courses and lab experience. Additionally, I was tasked with efficiently grading assignments and tests while providing constructive feedback to support student </w:t>
-      </w:r>
-      <w:r>
-        <w:rPr>
-          <w:rFonts w:ascii="Times New Roman" w:hAnsi="Times New Roman" w:cs="Times New Roman"/>
-          <w:sz w:val="22"/>
-          <w:szCs w:val="22"/>
-        </w:rPr>
-        <w:t>growth</w:t>
-      </w:r>
-      <w:r>
-        <w:rPr>
-          <w:rFonts w:ascii="Times New Roman" w:hAnsi="Times New Roman" w:cs="Times New Roman"/>
-          <w:sz w:val="22"/>
-          <w:szCs w:val="22"/>
-        </w:rPr>
-        <w:t xml:space="preserve"> and</w:t>
-      </w:r>
-      <w:r>
-        <w:rPr>
-          <w:rFonts w:ascii="Times New Roman" w:hAnsi="Times New Roman" w:cs="Times New Roman"/>
-          <w:sz w:val="22"/>
-          <w:szCs w:val="22"/>
-        </w:rPr>
-        <w:t xml:space="preserve"> regularly attending class to build strong relationships with </w:t>
-      </w:r>
-      <w:r>
-        <w:rPr>
-          <w:rFonts w:ascii="Times New Roman" w:hAnsi="Times New Roman" w:cs="Times New Roman"/>
-          <w:sz w:val="22"/>
-          <w:szCs w:val="22"/>
-        </w:rPr>
-        <w:t xml:space="preserve"> courses of roughly 100 </w:t>
-      </w:r>
-      <w:r>
-        <w:rPr>
-          <w:rFonts w:ascii="Times New Roman" w:hAnsi="Times New Roman" w:cs="Times New Roman"/>
-          <w:sz w:val="22"/>
-          <w:szCs w:val="22"/>
-        </w:rPr>
-        <w:t xml:space="preserve">students. </w:t>
-      </w:r>
-    </w:p>
-    <w:p>
-      <w:pPr>
-        <w:rPr>
-          <w:rFonts w:ascii="Times New Roman" w:hAnsi="Times New Roman" w:cs="Times New Roman"/>
-          <w:sz w:val="22"/>
-          <w:szCs w:val="22"/>
-        </w:rPr>
-      </w:pPr>
-    </w:p>
-    <w:p>
-      <w:pPr>
-        <w:rPr>
-          <w:rFonts w:ascii="Times New Roman" w:hAnsi="Times New Roman" w:cs="Times New Roman"/>
-          <w:b/>
-          <w:bCs/>
-          <w:sz w:val="22"/>
-          <w:szCs w:val="22"/>
-        </w:rPr>
-      </w:pPr>
-      <w:r>
-        <w:rPr>
-          <w:rFonts w:ascii="Times New Roman" w:hAnsi="Times New Roman" w:cs="Times New Roman"/>
-          <w:b/>
-          <w:bCs/>
-          <w:sz w:val="22"/>
-          <w:szCs w:val="22"/>
-        </w:rPr>
-        <w:t>Teaching Assistant</w:t>
-      </w:r>
-    </w:p>
-    <w:p>
-      <w:pPr>
-        <w:rPr>
-          <w:rFonts w:ascii="Times New Roman" w:hAnsi="Times New Roman" w:cs="Times New Roman"/>
-          <w:sz w:val="22"/>
-          <w:szCs w:val="22"/>
-        </w:rPr>
-      </w:pPr>
-      <w:r>
-        <w:rPr>
-          <w:rFonts w:ascii="Times New Roman" w:hAnsi="Times New Roman" w:cs="Times New Roman"/>
-          <w:sz w:val="22"/>
-          <w:szCs w:val="22"/>
-        </w:rPr>
-        <w:t xml:space="preserve">PSY 250 – Research Design &amp; Analysis </w:t>
-      </w:r>
-      <w:r>
-        <w:rPr>
-          <w:rFonts w:ascii="Times New Roman" w:hAnsi="Times New Roman" w:cs="Times New Roman"/>
-          <w:sz w:val="22"/>
-          <w:szCs w:val="22"/>
-        </w:rPr>
-        <w:t>I</w:t>
-      </w:r>
-      <w:r>
-        <w:rPr>
-          <w:rFonts w:ascii="Times New Roman" w:hAnsi="Times New Roman" w:cs="Times New Roman"/>
-          <w:sz w:val="22"/>
-          <w:szCs w:val="22"/>
-        </w:rPr>
         <w:tab/>
       </w:r>
       <w:r>
@@ -4156,14 +4457,6 @@
           <w:szCs w:val="22"/>
         </w:rPr>
         <w:t xml:space="preserve">     </w:t>
-      </w:r>
-      <w:r>
-        <w:rPr>
-          <w:rFonts w:ascii="Times New Roman" w:hAnsi="Times New Roman" w:cs="Times New Roman"/>
-          <w:sz w:val="22"/>
-          <w:szCs w:val="22"/>
-        </w:rPr>
-        <w:t>Fall 2022</w:t>
       </w:r>
     </w:p>
     <w:p>
@@ -4721,7 +5014,23 @@
           <w:sz w:val="22"/>
           <w:szCs w:val="22"/>
         </w:rPr>
-        <w:t>HoloLens 2, &amp; Meta Quest 3.</w:t>
+        <w:t>HoloLens 2, &amp; Meta Quest 3</w:t>
+      </w:r>
+      <w:r>
+        <w:rPr>
+          <w:rFonts w:ascii="Times New Roman" w:hAnsi="Times New Roman" w:cs="Times New Roman"/>
+          <w:sz w:val="22"/>
+          <w:szCs w:val="22"/>
+        </w:rPr>
+        <w:t>, computer vision</w:t>
+      </w:r>
+      <w:r>
+        <w:rPr>
+          <w:rFonts w:ascii="Times New Roman" w:hAnsi="Times New Roman" w:cs="Times New Roman"/>
+          <w:sz w:val="22"/>
+          <w:szCs w:val="22"/>
+        </w:rPr>
+        <w:t>.</w:t>
       </w:r>
     </w:p>
     <w:p>
@@ -5036,181 +5345,377 @@
     </w:p>
     <w:p>
       <w:pPr>
+        <w:rPr>
+          <w:rFonts w:ascii="Times New Roman" w:hAnsi="Times New Roman" w:cs="Times New Roman"/>
+          <w:b/>
+          <w:bCs/>
+          <w:sz w:val="22"/>
+          <w:szCs w:val="22"/>
+        </w:rPr>
+      </w:pPr>
+      <w:r>
+        <w:rPr>
+          <w:rFonts w:ascii="Times New Roman" w:hAnsi="Times New Roman" w:cs="Times New Roman"/>
+          <w:b/>
+          <w:bCs/>
+          <w:sz w:val="22"/>
+          <w:szCs w:val="22"/>
+        </w:rPr>
+        <w:t>MEMBERSHIPS</w:t>
+      </w:r>
+    </w:p>
+    <w:p>
+      <w:pPr>
+        <w:pBdr>
+          <w:top w:val="single" w:sz="4" w:space="1" w:color="auto"/>
+          <w:bottom w:val="single" w:sz="4" w:space="1" w:color="auto"/>
+        </w:pBdr>
+        <w:rPr>
+          <w:rFonts w:ascii="Times New Roman" w:hAnsi="Times New Roman" w:cs="Times New Roman"/>
+          <w:i/>
+          <w:iCs/>
+          <w:sz w:val="22"/>
+          <w:szCs w:val="22"/>
+        </w:rPr>
+      </w:pPr>
+      <w:r>
+        <w:rPr>
+          <w:rFonts w:ascii="Times New Roman" w:hAnsi="Times New Roman" w:cs="Times New Roman"/>
+          <w:sz w:val="22"/>
+          <w:szCs w:val="22"/>
+        </w:rPr>
+        <w:t xml:space="preserve">Human Factors and Ergonomics Society (HFES) – Student Affiliate </w:t>
+      </w:r>
+      <w:r>
+        <w:rPr>
+          <w:rFonts w:ascii="Times New Roman" w:hAnsi="Times New Roman" w:cs="Times New Roman"/>
+          <w:sz w:val="22"/>
+          <w:szCs w:val="22"/>
+        </w:rPr>
+        <w:tab/>
+      </w:r>
+      <w:r>
+        <w:rPr>
+          <w:rFonts w:ascii="Times New Roman" w:hAnsi="Times New Roman" w:cs="Times New Roman"/>
+          <w:sz w:val="22"/>
+          <w:szCs w:val="22"/>
+        </w:rPr>
+        <w:tab/>
+      </w:r>
+      <w:r>
+        <w:rPr>
+          <w:rFonts w:ascii="Times New Roman" w:hAnsi="Times New Roman" w:cs="Times New Roman"/>
+          <w:sz w:val="22"/>
+          <w:szCs w:val="22"/>
+        </w:rPr>
+        <w:tab/>
+      </w:r>
+      <w:r>
+        <w:rPr>
+          <w:rFonts w:ascii="Times New Roman" w:hAnsi="Times New Roman" w:cs="Times New Roman"/>
+          <w:sz w:val="22"/>
+          <w:szCs w:val="22"/>
+        </w:rPr>
+        <w:tab/>
+      </w:r>
+      <w:r>
+        <w:rPr>
+          <w:rFonts w:ascii="Times New Roman" w:hAnsi="Times New Roman" w:cs="Times New Roman"/>
+          <w:sz w:val="22"/>
+          <w:szCs w:val="22"/>
+        </w:rPr>
+        <w:t xml:space="preserve">  </w:t>
+      </w:r>
+      <w:r>
+        <w:rPr>
+          <w:rFonts w:ascii="Times New Roman" w:hAnsi="Times New Roman" w:cs="Times New Roman"/>
+          <w:sz w:val="22"/>
+          <w:szCs w:val="22"/>
+        </w:rPr>
+        <w:t xml:space="preserve">2025 – </w:t>
+      </w:r>
+      <w:r>
+        <w:rPr>
+          <w:rFonts w:ascii="Times New Roman" w:hAnsi="Times New Roman" w:cs="Times New Roman"/>
+          <w:i/>
+          <w:iCs/>
+          <w:sz w:val="22"/>
+          <w:szCs w:val="22"/>
+        </w:rPr>
+        <w:t>Present</w:t>
+      </w:r>
+    </w:p>
+    <w:p>
+      <w:pPr>
+        <w:pBdr>
+          <w:top w:val="single" w:sz="4" w:space="1" w:color="auto"/>
+          <w:bottom w:val="single" w:sz="4" w:space="1" w:color="auto"/>
+        </w:pBdr>
+        <w:rPr>
+          <w:rFonts w:ascii="Times New Roman" w:hAnsi="Times New Roman" w:cs="Times New Roman"/>
+          <w:i/>
+          <w:iCs/>
+          <w:sz w:val="22"/>
+          <w:szCs w:val="22"/>
+        </w:rPr>
+      </w:pPr>
+      <w:r>
+        <w:rPr>
+          <w:rFonts w:ascii="Times New Roman" w:hAnsi="Times New Roman" w:cs="Times New Roman"/>
+          <w:sz w:val="22"/>
+          <w:szCs w:val="22"/>
+        </w:rPr>
+        <w:t>Human AI Teaming (HART) Technical Group (HFES)</w:t>
+      </w:r>
+      <w:r>
+        <w:rPr>
+          <w:rFonts w:ascii="Times New Roman" w:hAnsi="Times New Roman" w:cs="Times New Roman"/>
+          <w:sz w:val="22"/>
+          <w:szCs w:val="22"/>
+        </w:rPr>
+        <w:tab/>
+      </w:r>
+      <w:r>
+        <w:rPr>
+          <w:rFonts w:ascii="Times New Roman" w:hAnsi="Times New Roman" w:cs="Times New Roman"/>
+          <w:sz w:val="22"/>
+          <w:szCs w:val="22"/>
+        </w:rPr>
+        <w:tab/>
+      </w:r>
+      <w:r>
+        <w:rPr>
+          <w:rFonts w:ascii="Times New Roman" w:hAnsi="Times New Roman" w:cs="Times New Roman"/>
+          <w:sz w:val="22"/>
+          <w:szCs w:val="22"/>
+        </w:rPr>
+        <w:tab/>
+      </w:r>
+      <w:r>
+        <w:rPr>
+          <w:rFonts w:ascii="Times New Roman" w:hAnsi="Times New Roman" w:cs="Times New Roman"/>
+          <w:sz w:val="22"/>
+          <w:szCs w:val="22"/>
+        </w:rPr>
+        <w:tab/>
+      </w:r>
+      <w:r>
+        <w:rPr>
+          <w:rFonts w:ascii="Times New Roman" w:hAnsi="Times New Roman" w:cs="Times New Roman"/>
+          <w:sz w:val="22"/>
+          <w:szCs w:val="22"/>
+        </w:rPr>
+        <w:tab/>
+      </w:r>
+      <w:r>
+        <w:rPr>
+          <w:rFonts w:ascii="Times New Roman" w:hAnsi="Times New Roman" w:cs="Times New Roman"/>
+          <w:sz w:val="22"/>
+          <w:szCs w:val="22"/>
+        </w:rPr>
+        <w:tab/>
+      </w:r>
+      <w:r>
+        <w:rPr>
+          <w:rFonts w:ascii="Times New Roman" w:hAnsi="Times New Roman" w:cs="Times New Roman"/>
+          <w:sz w:val="22"/>
+          <w:szCs w:val="22"/>
+        </w:rPr>
+        <w:t xml:space="preserve">  </w:t>
+      </w:r>
+      <w:r>
+        <w:rPr>
+          <w:rFonts w:ascii="Times New Roman" w:hAnsi="Times New Roman" w:cs="Times New Roman"/>
+          <w:sz w:val="22"/>
+          <w:szCs w:val="22"/>
+        </w:rPr>
+        <w:t xml:space="preserve">2026 – </w:t>
+      </w:r>
+      <w:r>
+        <w:rPr>
+          <w:rFonts w:ascii="Times New Roman" w:hAnsi="Times New Roman" w:cs="Times New Roman"/>
+          <w:i/>
+          <w:iCs/>
+          <w:sz w:val="22"/>
+          <w:szCs w:val="22"/>
+        </w:rPr>
+        <w:t xml:space="preserve">Present </w:t>
+      </w:r>
+    </w:p>
+    <w:p>
+      <w:pPr>
+        <w:pBdr>
+          <w:top w:val="single" w:sz="4" w:space="1" w:color="auto"/>
+          <w:bottom w:val="single" w:sz="4" w:space="1" w:color="auto"/>
+        </w:pBdr>
+        <w:rPr>
+          <w:rFonts w:ascii="Times New Roman" w:hAnsi="Times New Roman" w:cs="Times New Roman"/>
+          <w:sz w:val="22"/>
+          <w:szCs w:val="22"/>
+        </w:rPr>
+      </w:pPr>
+    </w:p>
+    <w:p>
+      <w:pPr>
+        <w:pBdr>
+          <w:top w:val="single" w:sz="4" w:space="1" w:color="auto"/>
+          <w:bottom w:val="single" w:sz="4" w:space="1" w:color="auto"/>
+        </w:pBdr>
+        <w:rPr>
+          <w:rFonts w:ascii="Times New Roman" w:hAnsi="Times New Roman" w:cs="Times New Roman"/>
+          <w:b/>
+          <w:bCs/>
+          <w:sz w:val="22"/>
+          <w:szCs w:val="22"/>
+        </w:rPr>
+      </w:pPr>
+      <w:r>
+        <w:rPr>
+          <w:rFonts w:ascii="Times New Roman" w:hAnsi="Times New Roman" w:cs="Times New Roman"/>
+          <w:b/>
+          <w:bCs/>
+          <w:sz w:val="22"/>
+          <w:szCs w:val="22"/>
+        </w:rPr>
+        <w:t>APPEARS IN</w:t>
+      </w:r>
+    </w:p>
+    <w:p>
+      <w:pPr>
         <w:pBdr>
           <w:bottom w:val="single" w:sz="4" w:space="1" w:color="auto"/>
         </w:pBdr>
         <w:rPr>
           <w:rFonts w:ascii="Times New Roman" w:hAnsi="Times New Roman" w:cs="Times New Roman"/>
-          <w:b/>
-          <w:bCs/>
-          <w:sz w:val="22"/>
-          <w:szCs w:val="22"/>
-        </w:rPr>
-      </w:pPr>
-      <w:r>
-        <w:rPr>
-          <w:rFonts w:ascii="Times New Roman" w:hAnsi="Times New Roman" w:cs="Times New Roman"/>
-          <w:b/>
-          <w:bCs/>
-          <w:sz w:val="22"/>
-          <w:szCs w:val="22"/>
-        </w:rPr>
-        <w:t>MEMBERSHIPS</w:t>
+          <w:sz w:val="22"/>
+          <w:szCs w:val="22"/>
+        </w:rPr>
+      </w:pPr>
+      <w:r>
+        <w:rPr>
+          <w:rFonts w:ascii="Times New Roman" w:hAnsi="Times New Roman" w:cs="Times New Roman"/>
+          <w:sz w:val="22"/>
+          <w:szCs w:val="22"/>
+        </w:rPr>
+        <w:t xml:space="preserve">UW College of Engineering Editorial – </w:t>
+      </w:r>
+      <w:hyperlink r:id="rId10" w:history="1">
+        <w:r>
+          <w:rPr>
+            <w:rStyle w:val="Hyperlink"/>
+            <w:rFonts w:ascii="Times New Roman" w:hAnsi="Times New Roman" w:cs="Times New Roman"/>
+            <w:sz w:val="22"/>
+            <w:szCs w:val="22"/>
+          </w:rPr>
+          <w:t>How do robots impact search-and-rescue teamwork? Engineers look at human brain activity to find out</w:t>
+        </w:r>
+      </w:hyperlink>
+      <w:r>
+        <w:rPr>
+          <w:rFonts w:ascii="Times New Roman" w:hAnsi="Times New Roman" w:cs="Times New Roman"/>
+          <w:sz w:val="22"/>
+          <w:szCs w:val="22"/>
+        </w:rPr>
+        <w:t xml:space="preserve"> – </w:t>
+      </w:r>
+      <w:r>
+        <w:rPr>
+          <w:rFonts w:ascii="Times New Roman" w:hAnsi="Times New Roman" w:cs="Times New Roman"/>
+          <w:b/>
+          <w:bCs/>
+          <w:sz w:val="22"/>
+          <w:szCs w:val="22"/>
+        </w:rPr>
+        <w:t>4/13/26</w:t>
       </w:r>
     </w:p>
     <w:p>
       <w:pPr>
         <w:pBdr>
-          <w:top w:val="single" w:sz="4" w:space="1" w:color="auto"/>
+          <w:bottom w:val="single" w:sz="4" w:space="1" w:color="auto"/>
         </w:pBdr>
         <w:rPr>
           <w:rFonts w:ascii="Times New Roman" w:hAnsi="Times New Roman" w:cs="Times New Roman"/>
-          <w:i/>
-          <w:iCs/>
-          <w:sz w:val="22"/>
-          <w:szCs w:val="22"/>
-        </w:rPr>
-      </w:pPr>
-      <w:r>
-        <w:rPr>
-          <w:rFonts w:ascii="Times New Roman" w:hAnsi="Times New Roman" w:cs="Times New Roman"/>
-          <w:sz w:val="22"/>
-          <w:szCs w:val="22"/>
-        </w:rPr>
-        <w:t xml:space="preserve">Human Factors and Ergonomics Society (HFES) – Student Affiliate </w:t>
-      </w:r>
-      <w:r>
-        <w:rPr>
-          <w:rFonts w:ascii="Times New Roman" w:hAnsi="Times New Roman" w:cs="Times New Roman"/>
-          <w:sz w:val="22"/>
-          <w:szCs w:val="22"/>
-        </w:rPr>
-        <w:tab/>
-      </w:r>
-      <w:r>
-        <w:rPr>
-          <w:rFonts w:ascii="Times New Roman" w:hAnsi="Times New Roman" w:cs="Times New Roman"/>
-          <w:sz w:val="22"/>
-          <w:szCs w:val="22"/>
-        </w:rPr>
-        <w:tab/>
-      </w:r>
-      <w:r>
-        <w:rPr>
-          <w:rFonts w:ascii="Times New Roman" w:hAnsi="Times New Roman" w:cs="Times New Roman"/>
-          <w:sz w:val="22"/>
-          <w:szCs w:val="22"/>
-        </w:rPr>
-        <w:tab/>
-      </w:r>
-      <w:r>
-        <w:rPr>
-          <w:rFonts w:ascii="Times New Roman" w:hAnsi="Times New Roman" w:cs="Times New Roman"/>
-          <w:sz w:val="22"/>
-          <w:szCs w:val="22"/>
-        </w:rPr>
-        <w:tab/>
-        <w:t xml:space="preserve">2025 – </w:t>
-      </w:r>
-      <w:r>
-        <w:rPr>
-          <w:rFonts w:ascii="Times New Roman" w:hAnsi="Times New Roman" w:cs="Times New Roman"/>
-          <w:i/>
-          <w:iCs/>
-          <w:sz w:val="22"/>
-          <w:szCs w:val="22"/>
-        </w:rPr>
-        <w:t>Present</w:t>
+          <w:sz w:val="22"/>
+          <w:szCs w:val="22"/>
+        </w:rPr>
+      </w:pPr>
+      <w:r>
+        <w:rPr>
+          <w:rFonts w:ascii="Times New Roman" w:hAnsi="Times New Roman" w:cs="Times New Roman"/>
+          <w:sz w:val="22"/>
+          <w:szCs w:val="22"/>
+        </w:rPr>
+        <w:fldChar w:fldCharType="begin"/>
+      </w:r>
+      <w:r>
+        <w:rPr>
+          <w:rFonts w:ascii="Times New Roman" w:hAnsi="Times New Roman" w:cs="Times New Roman"/>
+          <w:sz w:val="22"/>
+          <w:szCs w:val="22"/>
+        </w:rPr>
+        <w:instrText>HYPERLINK "https://www.rit.edu/emailcommunications/aware-ai-newsletter-fall-2025/streamable"</w:instrText>
+      </w:r>
+      <w:r>
+        <w:rPr>
+          <w:rFonts w:ascii="Times New Roman" w:hAnsi="Times New Roman" w:cs="Times New Roman"/>
+          <w:sz w:val="22"/>
+          <w:szCs w:val="22"/>
+        </w:rPr>
+      </w:r>
+      <w:r>
+        <w:rPr>
+          <w:rFonts w:ascii="Times New Roman" w:hAnsi="Times New Roman" w:cs="Times New Roman"/>
+          <w:sz w:val="22"/>
+          <w:szCs w:val="22"/>
+        </w:rPr>
+        <w:fldChar w:fldCharType="separate"/>
+      </w:r>
+      <w:r>
+        <w:rPr>
+          <w:rStyle w:val="Hyperlink"/>
+          <w:rFonts w:ascii="Times New Roman" w:hAnsi="Times New Roman" w:cs="Times New Roman"/>
+          <w:sz w:val="22"/>
+          <w:szCs w:val="22"/>
+        </w:rPr>
+        <w:t>RIT Newsletter</w:t>
+      </w:r>
+      <w:r>
+        <w:rPr>
+          <w:rFonts w:ascii="Times New Roman" w:hAnsi="Times New Roman" w:cs="Times New Roman"/>
+          <w:sz w:val="22"/>
+          <w:szCs w:val="22"/>
+        </w:rPr>
+        <w:fldChar w:fldCharType="end"/>
+      </w:r>
+      <w:r>
+        <w:rPr>
+          <w:rFonts w:ascii="Times New Roman" w:hAnsi="Times New Roman" w:cs="Times New Roman"/>
+          <w:sz w:val="22"/>
+          <w:szCs w:val="22"/>
+        </w:rPr>
+        <w:t xml:space="preserve"> – </w:t>
+      </w:r>
+      <w:r>
+        <w:rPr>
+          <w:rFonts w:ascii="Times New Roman" w:hAnsi="Times New Roman" w:cs="Times New Roman"/>
+          <w:b/>
+          <w:bCs/>
+          <w:sz w:val="22"/>
+          <w:szCs w:val="22"/>
+        </w:rPr>
+        <w:t>December 2025</w:t>
       </w:r>
     </w:p>
     <w:p>
       <w:pPr>
         <w:pBdr>
-          <w:top w:val="single" w:sz="4" w:space="1" w:color="auto"/>
+          <w:bottom w:val="single" w:sz="4" w:space="1" w:color="auto"/>
         </w:pBdr>
         <w:rPr>
           <w:rFonts w:ascii="Times New Roman" w:hAnsi="Times New Roman" w:cs="Times New Roman"/>
-          <w:i/>
-          <w:iCs/>
-          <w:sz w:val="22"/>
-          <w:szCs w:val="22"/>
-        </w:rPr>
-      </w:pPr>
-      <w:r>
-        <w:rPr>
-          <w:rFonts w:ascii="Times New Roman" w:hAnsi="Times New Roman" w:cs="Times New Roman"/>
-          <w:sz w:val="22"/>
-          <w:szCs w:val="22"/>
-        </w:rPr>
-        <w:t>Human AI Teaming (HART) Technical Group (HFES)</w:t>
-      </w:r>
-      <w:r>
-        <w:rPr>
-          <w:rFonts w:ascii="Times New Roman" w:hAnsi="Times New Roman" w:cs="Times New Roman"/>
-          <w:sz w:val="22"/>
-          <w:szCs w:val="22"/>
-        </w:rPr>
-        <w:tab/>
-      </w:r>
-      <w:r>
-        <w:rPr>
-          <w:rFonts w:ascii="Times New Roman" w:hAnsi="Times New Roman" w:cs="Times New Roman"/>
-          <w:sz w:val="22"/>
-          <w:szCs w:val="22"/>
-        </w:rPr>
-        <w:tab/>
-      </w:r>
-      <w:r>
-        <w:rPr>
-          <w:rFonts w:ascii="Times New Roman" w:hAnsi="Times New Roman" w:cs="Times New Roman"/>
-          <w:sz w:val="22"/>
-          <w:szCs w:val="22"/>
-        </w:rPr>
-        <w:tab/>
-      </w:r>
-      <w:r>
-        <w:rPr>
-          <w:rFonts w:ascii="Times New Roman" w:hAnsi="Times New Roman" w:cs="Times New Roman"/>
-          <w:sz w:val="22"/>
-          <w:szCs w:val="22"/>
-        </w:rPr>
-        <w:tab/>
-      </w:r>
-      <w:r>
-        <w:rPr>
-          <w:rFonts w:ascii="Times New Roman" w:hAnsi="Times New Roman" w:cs="Times New Roman"/>
-          <w:sz w:val="22"/>
-          <w:szCs w:val="22"/>
-        </w:rPr>
-        <w:tab/>
-      </w:r>
-      <w:r>
-        <w:rPr>
-          <w:rFonts w:ascii="Times New Roman" w:hAnsi="Times New Roman" w:cs="Times New Roman"/>
-          <w:sz w:val="22"/>
-          <w:szCs w:val="22"/>
-        </w:rPr>
-        <w:tab/>
-        <w:t xml:space="preserve">2026 – </w:t>
-      </w:r>
-      <w:r>
-        <w:rPr>
-          <w:rFonts w:ascii="Times New Roman" w:hAnsi="Times New Roman" w:cs="Times New Roman"/>
-          <w:i/>
-          <w:iCs/>
-          <w:sz w:val="22"/>
-          <w:szCs w:val="22"/>
-        </w:rPr>
-        <w:t xml:space="preserve">Present </w:t>
-      </w:r>
-    </w:p>
-    <w:p>
-      <w:pPr>
-        <w:pBdr>
-          <w:top w:val="single" w:sz="4" w:space="1" w:color="auto"/>
-        </w:pBdr>
-        <w:rPr>
-          <w:rFonts w:ascii="Times New Roman" w:hAnsi="Times New Roman" w:cs="Times New Roman"/>
+          <w:b/>
+          <w:bCs/>
           <w:sz w:val="22"/>
           <w:szCs w:val="22"/>
         </w:rPr>
@@ -5263,7 +5768,7 @@
         </w:rPr>
         <w:t xml:space="preserve">Neuroergonomics, as defined by </w:t>
       </w:r>
-      <w:hyperlink r:id="rId10" w:history="1">
+      <w:hyperlink r:id="rId11" w:history="1">
         <w:r>
           <w:rPr>
             <w:rStyle w:val="Hyperlink"/>
@@ -5322,7 +5827,7 @@
         </w:rPr>
         <w:t xml:space="preserve">The </w:t>
       </w:r>
-      <w:hyperlink r:id="rId11" w:history="1">
+      <w:hyperlink r:id="rId12" w:history="1">
         <w:r>
           <w:rPr>
             <w:rStyle w:val="Hyperlink"/>

</xml_diff>